<commit_message>
latest from internal 5/5/2026
</commit_message>
<xml_diff>
--- a/UserDocumentation/GigiViewerDX12_Documentation.docx
+++ b/UserDocumentation/GigiViewerDX12_Documentation.docx
@@ -146,6 +146,9 @@
       </w:r>
       <w:r>
         <w:t>: Runs a python script after launching the viewer. All arguments after this run command are passed to the python script in the sys.argv array, as per usual.</w:t>
+      </w:r>
+      <w:r>
+        <w:t xml:space="preserve"> Update: you can now also omit -run, and it detects when you pass a .py on the command line, passing the rest of the parameters to the python script as argv.</w:t>
       </w:r>
     </w:p>
     <w:p>
@@ -347,6 +350,7 @@
           <w:b/>
           <w:bCs/>
         </w:rPr>
+        <w:lastRenderedPageBreak/>
         <w:t>-nowebcam:</w:t>
       </w:r>
       <w:r>
@@ -385,11 +389,29 @@
           <w:b/>
           <w:bCs/>
         </w:rPr>
-        <w:lastRenderedPageBreak/>
         <w:t>-dred:</w:t>
       </w:r>
       <w:r>
         <w:t xml:space="preserve"> Makes a DredLog.txt if the gpu ever hangs. Useful for finding which shader has an infinite loop or similar.</w:t>
+      </w:r>
+    </w:p>
+    <w:p>
+      <w:pPr>
+        <w:pStyle w:val="ListParagraph"/>
+        <w:numPr>
+          <w:ilvl w:val="0"/>
+          <w:numId w:val="1"/>
+        </w:numPr>
+      </w:pPr>
+      <w:r>
+        <w:rPr>
+          <w:b/>
+          <w:bCs/>
+        </w:rPr>
+        <w:t>-listenPort</w:t>
+      </w:r>
+      <w:r>
+        <w:t>: Specifies the port the viewer listens on. You can telnet or raw connect to this port and send python commands to run. The MCP server uses this port to operate as well. Use -1 to not listen on any port.</w:t>
       </w:r>
     </w:p>
     <w:p>
@@ -500,6 +522,7 @@
         <w:rPr>
           <w:noProof/>
         </w:rPr>
+        <w:lastRenderedPageBreak/>
         <w:drawing>
           <wp:inline distT="0" distB="0" distL="0" distR="0" wp14:anchorId="19E53AB3" wp14:editId="437B969C">
             <wp:extent cx="5943600" cy="1896745"/>
@@ -551,49 +574,108 @@
         </w:numPr>
       </w:pPr>
       <w:r>
+        <w:t>.nodes.bvh – contains the BVHNodes in the format shown above.</w:t>
+      </w:r>
+    </w:p>
+    <w:p>
+      <w:pPr>
+        <w:pStyle w:val="ListParagraph"/>
+        <w:numPr>
+          <w:ilvl w:val="0"/>
+          <w:numId w:val="1"/>
+        </w:numPr>
+      </w:pPr>
+      <w:r>
+        <w:t>.triindices.bvh – The lists of triangles for each BVH node (firstTri and triCount). Uint32.</w:t>
+      </w:r>
+    </w:p>
+    <w:p>
+      <w:pPr>
+        <w:pStyle w:val="ListParagraph"/>
+        <w:numPr>
+          <w:ilvl w:val="0"/>
+          <w:numId w:val="1"/>
+        </w:numPr>
+      </w:pPr>
+      <w:r>
+        <w:t>.vertices.bvh – The list of triangle vertex positions. Float4.  Vertices for a triangle are found by multiplying the triangle index by 3 to get the first vertex, and the next two indices are the other two vertices.</w:t>
+      </w:r>
+    </w:p>
+    <w:p>
+      <w:pPr>
+        <w:pStyle w:val="ListParagraph"/>
+        <w:numPr>
+          <w:ilvl w:val="0"/>
+          <w:numId w:val="1"/>
+        </w:numPr>
+      </w:pPr>
+      <w:r>
+        <w:t>.combined.bvh – This contains all other data in a single file.  This file begins with two uint32s which specify the size in bytes of the vert data and node data respectively. After that is the vertex data, the node data, and lastly is the triangle indices data.</w:t>
+      </w:r>
+    </w:p>
+    <w:p>
+      <w:r>
+        <w:t>An example of using these files can be found in the “tinybvh” demo in the Gigi browser.</w:t>
+      </w:r>
+    </w:p>
+    <w:p>
+      <w:pPr>
+        <w:pStyle w:val="Heading1"/>
+      </w:pPr>
+      <w:r>
+        <w:t>Pix Captures</w:t>
+      </w:r>
+    </w:p>
+    <w:p>
+      <w:r>
+        <w:t>To take a pix capture, click the “Pix Capture” button.  Next to this button is a text box which lets you specify how many frames to capture.</w:t>
+      </w:r>
+    </w:p>
+    <w:p>
+      <w:r>
+        <w:t>If you want debug symbols in your shaders for the pix capture, make sure “Compile Shaders For Debug” is turned on, under the Settings menu.</w:t>
+      </w:r>
+    </w:p>
+    <w:p>
+      <w:r>
+        <w:t>When the profiler window is shown, it will put GPU timing queries into the command list to get the GPU profiling numbers.  These timing queries will then also show up in your pix captures as “EndQuery” calls.  If you want to remove these, close the profiler window before taking a capture.</w:t>
+      </w:r>
+    </w:p>
+    <w:p>
+      <w:r>
+        <w:t>If you notice a lot of PCIE traffic in your pix capture, it may be that other applications are fighting with Gigi for vram.  Closing things like browsers, photoshop, or similar applications which require a lot of GPU memory can help clear that up to give you more accurate timings.</w:t>
+      </w:r>
+    </w:p>
+    <w:p>
+      <w:pPr>
+        <w:pStyle w:val="Heading1"/>
+      </w:pPr>
+      <w:r>
+        <w:t>Telnet Connection</w:t>
+      </w:r>
+    </w:p>
+    <w:p>
+      <w:r>
+        <w:t>The viewer listens on port 6161(by default) for connections. You can connect with telnet, or a raw connection. Whatever you type is processed as python. This telnet interface is also used by the MCP server.</w:t>
+      </w:r>
+    </w:p>
+    <w:p>
+      <w:pPr>
+        <w:pStyle w:val="Heading1"/>
+      </w:pPr>
+      <w:r>
+        <w:t>MCP (Model Context Protocol) Server</w:t>
+      </w:r>
+    </w:p>
+    <w:p>
+      <w:r>
+        <w:t>MCP servers are a standardized protocol for agents to interface with software.</w:t>
+      </w:r>
+    </w:p>
+    <w:p>
+      <w:r>
         <w:lastRenderedPageBreak/>
-        <w:t>.nodes.bvh – contains the BVHNodes in the format shown above.</w:t>
-      </w:r>
-    </w:p>
-    <w:p>
-      <w:pPr>
-        <w:pStyle w:val="ListParagraph"/>
-        <w:numPr>
-          <w:ilvl w:val="0"/>
-          <w:numId w:val="1"/>
-        </w:numPr>
-      </w:pPr>
-      <w:r>
-        <w:t>.triindices.bvh – The lists of triangles for each BVH node (firstTri and triCount). Uint32.</w:t>
-      </w:r>
-    </w:p>
-    <w:p>
-      <w:pPr>
-        <w:pStyle w:val="ListParagraph"/>
-        <w:numPr>
-          <w:ilvl w:val="0"/>
-          <w:numId w:val="1"/>
-        </w:numPr>
-      </w:pPr>
-      <w:r>
-        <w:t>.vertices.bvh – The list of triangle vertex positions. Float4.  Vertices for a triangle are found by multiplying the triangle index by 3 to get the first vertex, and the next two indices are the other two vertices.</w:t>
-      </w:r>
-    </w:p>
-    <w:p>
-      <w:pPr>
-        <w:pStyle w:val="ListParagraph"/>
-        <w:numPr>
-          <w:ilvl w:val="0"/>
-          <w:numId w:val="1"/>
-        </w:numPr>
-      </w:pPr>
-      <w:r>
-        <w:t>.combined.bvh – This contains all other data in a single file.  This file begins with two uint32s which specify the size in bytes of the vert data and node data respectively. After that is the vertex data, the node data, and lastly is the triangle indices data.</w:t>
-      </w:r>
-    </w:p>
-    <w:p>
-      <w:r>
-        <w:t>An example of using these files can be found in the “tinybvh” demo in the Gigi browser.</w:t>
+        <w:t>GigiMCP.exe is an MCP server for the Gigi viewer that is capable of launching the viewer on the local machine.  It is also capable of connecting to a viewer either on the local machine, or other machines (need to give an IP or a name) on a specified port, and then sending commands.  The commands include almost every python function, and some other functionality as well, including running python strings or python files on disk, in the viewer’s context.</w:t>
       </w:r>
     </w:p>
     <w:p>
@@ -601,34 +683,6 @@
         <w:pStyle w:val="Heading1"/>
       </w:pPr>
       <w:r>
-        <w:t>Pix Captures</w:t>
-      </w:r>
-    </w:p>
-    <w:p>
-      <w:r>
-        <w:t>To take a pix capture, click the “Pix Capture” button.  Next to this button is a text box which lets you specify how many frames to capture.</w:t>
-      </w:r>
-    </w:p>
-    <w:p>
-      <w:r>
-        <w:t>If you want debug symbols in your shaders for the pix capture, make sure “Compile Shaders For Debug” is turned on, under the Settings menu.</w:t>
-      </w:r>
-    </w:p>
-    <w:p>
-      <w:r>
-        <w:t>When the profiler window is shown, it will put GPU timing queries into the command list to get the GPU profiling numbers.  These timing queries will then also show up in your pix captures as “EndQuery” calls.  If you want to remove these, close the profiler window before taking a capture.</w:t>
-      </w:r>
-    </w:p>
-    <w:p>
-      <w:r>
-        <w:t>If you notice a lot of PCIE traffic in your pix capture, it may be that other applications are fighting with Gigi for vram.  Closing things like browsers, photoshop, or similar applications which require a lot of GPU memory can help clear that up to give you more accurate timings.</w:t>
-      </w:r>
-    </w:p>
-    <w:p>
-      <w:pPr>
-        <w:pStyle w:val="Heading1"/>
-      </w:pPr>
-      <w:r>
         <w:t>Python Interface</w:t>
       </w:r>
       <w:r>
@@ -639,6 +693,9 @@
       <w:r>
         <w:t>GigiViewerDX12.exe is able to run python files, and uses python 3.10.</w:t>
       </w:r>
+      <w:r>
+        <w:t xml:space="preserve"> There is also a python console in the viewer where you can run python commands.</w:t>
+      </w:r>
     </w:p>
     <w:p>
       <w:r>
@@ -667,7 +724,6 @@
     </w:p>
     <w:p>
       <w:r>
-        <w:lastRenderedPageBreak/>
         <w:t xml:space="preserve">Python runs in an isolated mode, using the python within Gigi, to not interfere with whatever python you may (or may not) have installed.  If you want to use a package that isn’t part of this isolated python, you can use pip to install it!  </w:t>
       </w:r>
     </w:p>
@@ -736,6 +792,7 @@
     </w:p>
     <w:p>
       <w:r>
+        <w:lastRenderedPageBreak/>
         <w:t>FFMPEG binaries can be downloaded from:</w:t>
       </w:r>
       <w:r>
@@ -954,7 +1011,6 @@
           <w:b/>
           <w:bCs/>
         </w:rPr>
-        <w:lastRenderedPageBreak/>
         <w:t xml:space="preserve">Host.SetVSync(set) – </w:t>
       </w:r>
       <w:r>
@@ -1103,7 +1159,11 @@
         <w:t>(set=true)</w:t>
       </w:r>
       <w:r>
-        <w:t xml:space="preserve"> – If true, .gguser files will not be saved. This is useful in automated testing or similar, where things will be changed, but it’s not desired that the .gguser file is updated.  .gguser files store all information set up in the viewer, such as variable values, system variable connections, and the details of imported resources.</w:t>
+        <w:t xml:space="preserve"> – If true, .gguser files will not be saved. This is useful in automated testing or similar, where things will be changed, but it’s not desired that the .gguser </w:t>
+      </w:r>
+      <w:r>
+        <w:lastRenderedPageBreak/>
+        <w:t>file is updated.  .gguser files store all information set up in the viewer, such as variable values, system variable connections, and the details of imported resources.</w:t>
       </w:r>
     </w:p>
     <w:p>
@@ -1133,6 +1193,13 @@
           <w:b/>
           <w:bCs/>
         </w:rPr>
+        <w:t>, autoClear=true</w:t>
+      </w:r>
+      <w:r>
+        <w:rPr>
+          <w:b/>
+          <w:bCs/>
+        </w:rPr>
         <w:t>)</w:t>
       </w:r>
       <w:r>
@@ -1153,6 +1220,9 @@
       <w:r>
         <w:t>”. While those names are a mouth full, they uniquely identify the resource to write, as well as what part of the rendering timeline to write the value.  There is a “copy to clipboard” button next to the name for your convenience.</w:t>
       </w:r>
+      <w:r>
+        <w:t xml:space="preserve">  If autoClear is true, this state is cleared when the script finishes execution.</w:t>
+      </w:r>
     </w:p>
     <w:p>
       <w:pPr>
@@ -1336,101 +1406,186 @@
           <w:b/>
           <w:bCs/>
         </w:rPr>
+        <w:t>Host.SaveAs</w:t>
+      </w:r>
+      <w:r>
+        <w:rPr>
+          <w:b/>
+          <w:bCs/>
+        </w:rPr>
+        <w:t>DDS_BC6</w:t>
+      </w:r>
+      <w:r>
+        <w:rPr>
+          <w:b/>
+          <w:bCs/>
+        </w:rPr>
+        <w:t>(filename, resourceName</w:t>
+      </w:r>
+      <w:r>
+        <w:rPr>
+          <w:b/>
+          <w:bCs/>
+        </w:rPr>
+        <w:t>, isSigned=False</w:t>
+      </w:r>
+      <w:r>
+        <w:rPr>
+          <w:b/>
+          <w:bCs/>
+        </w:rPr>
+        <w:t>, arrayindex=-1, mipIndex=-1)</w:t>
+      </w:r>
+      <w:r>
+        <w:t xml:space="preserve"> – This saves a texture resource to a file. If arrayIndex is -1, then each slice and mip level will be written out. Else you are expected to provide a specific arrayIndex and mipIndex.  SetWantReadback() must be called, and the technique must be executed, before you can use this function.</w:t>
+      </w:r>
+    </w:p>
+    <w:p>
+      <w:pPr>
+        <w:pStyle w:val="ListParagraph"/>
+        <w:numPr>
+          <w:ilvl w:val="0"/>
+          <w:numId w:val="3"/>
+        </w:numPr>
+      </w:pPr>
+      <w:r>
+        <w:rPr>
+          <w:b/>
+          <w:bCs/>
+        </w:rPr>
+        <w:t>Host.SaveAs</w:t>
+      </w:r>
+      <w:r>
+        <w:rPr>
+          <w:b/>
+          <w:bCs/>
+        </w:rPr>
+        <w:t>DDS_BC7</w:t>
+      </w:r>
+      <w:r>
+        <w:rPr>
+          <w:b/>
+          <w:bCs/>
+        </w:rPr>
+        <w:t>(filename, resourceName</w:t>
+      </w:r>
+      <w:r>
+        <w:rPr>
+          <w:b/>
+          <w:bCs/>
+        </w:rPr>
+        <w:t>, isSRGB=True</w:t>
+      </w:r>
+      <w:r>
+        <w:rPr>
+          <w:b/>
+          <w:bCs/>
+        </w:rPr>
+        <w:t>, arrayindex=-1, mipIndex=-1)</w:t>
+      </w:r>
+      <w:r>
+        <w:t xml:space="preserve"> – This saves a texture resource to a file. If arrayIndex is -1, then each slice and mip level will be written out. Else you are expected to provide a specific arrayIndex and mipIndex.  SetWantReadback() must be called, and the technique must be executed, before you can use this function.</w:t>
+      </w:r>
+    </w:p>
+    <w:p>
+      <w:pPr>
+        <w:pStyle w:val="ListParagraph"/>
+        <w:numPr>
+          <w:ilvl w:val="0"/>
+          <w:numId w:val="3"/>
+        </w:numPr>
+      </w:pPr>
+      <w:r>
+        <w:rPr>
+          <w:b/>
+          <w:bCs/>
+        </w:rPr>
+        <w:t>Host.</w:t>
+      </w:r>
+      <w:r>
+        <w:rPr>
+          <w:b/>
+          <w:bCs/>
+        </w:rPr>
+        <w:t>SaveAsEXR</w:t>
+      </w:r>
+      <w:r>
+        <w:rPr>
+          <w:b/>
+          <w:bCs/>
+        </w:rPr>
+        <w:t>(filename, resourceName, arrayindex=-1, mipIndex=-1)</w:t>
+      </w:r>
+      <w:r>
+        <w:t xml:space="preserve"> – This saves a texture resource to a</w:t>
+      </w:r>
+      <w:r>
+        <w:t xml:space="preserve"> </w:t>
+      </w:r>
+      <w:r>
+        <w:t>file. If arrayIndex is -1, then each slice and mip level will be written out. Else you are expected to provide a specific arrayIndex and mipIndex.  SetWantReadback() must be called, and the technique must be executed, before you can use this function.</w:t>
+      </w:r>
+    </w:p>
+    <w:p>
+      <w:pPr>
+        <w:pStyle w:val="ListParagraph"/>
+        <w:numPr>
+          <w:ilvl w:val="0"/>
+          <w:numId w:val="3"/>
+        </w:numPr>
+      </w:pPr>
+      <w:r>
+        <w:rPr>
+          <w:b/>
+          <w:bCs/>
+        </w:rPr>
+        <w:t>Host.</w:t>
+      </w:r>
+      <w:r>
+        <w:rPr>
+          <w:b/>
+          <w:bCs/>
+        </w:rPr>
+        <w:t>SaveAs</w:t>
+      </w:r>
+      <w:r>
+        <w:rPr>
+          <w:b/>
+          <w:bCs/>
+        </w:rPr>
+        <w:t>HDR</w:t>
+      </w:r>
+      <w:r>
+        <w:rPr>
+          <w:b/>
+          <w:bCs/>
+        </w:rPr>
+        <w:t>(filename, resourceName, arrayindex=-1, mipIndex=-1)</w:t>
+      </w:r>
+      <w:r>
+        <w:t xml:space="preserve"> – This saves a texture resource to a</w:t>
+      </w:r>
+      <w:r>
+        <w:t xml:space="preserve"> </w:t>
+      </w:r>
+      <w:r>
+        <w:t>file. If arrayIndex is -1, then each slice and mip level will be written out. Else you are expected to provide a specific arrayIndex and mipIndex.  SetWantReadback() must be called, and the technique must be executed, before you can use this function.</w:t>
+      </w:r>
+    </w:p>
+    <w:p>
+      <w:pPr>
+        <w:pStyle w:val="ListParagraph"/>
+        <w:numPr>
+          <w:ilvl w:val="0"/>
+          <w:numId w:val="3"/>
+        </w:numPr>
+      </w:pPr>
+      <w:r>
+        <w:rPr>
+          <w:b/>
+          <w:bCs/>
+        </w:rPr>
         <w:lastRenderedPageBreak/>
-        <w:t>Host.SaveAs</w:t>
-      </w:r>
-      <w:r>
-        <w:rPr>
-          <w:b/>
-          <w:bCs/>
-        </w:rPr>
-        <w:t>DDS_BC6</w:t>
-      </w:r>
-      <w:r>
-        <w:rPr>
-          <w:b/>
-          <w:bCs/>
-        </w:rPr>
-        <w:t>(filename, resourceName</w:t>
-      </w:r>
-      <w:r>
-        <w:rPr>
-          <w:b/>
-          <w:bCs/>
-        </w:rPr>
-        <w:t>, isSigned=False</w:t>
-      </w:r>
-      <w:r>
-        <w:rPr>
-          <w:b/>
-          <w:bCs/>
-        </w:rPr>
-        <w:t>, arrayindex=-1, mipIndex=-1)</w:t>
-      </w:r>
-      <w:r>
-        <w:t xml:space="preserve"> – This saves a texture resource to a file. If arrayIndex is -1, then each slice and mip level will be written out. Else you are expected to provide a specific arrayIndex and mipIndex.  SetWantReadback() must be called, and the technique must be executed, before you can use this function.</w:t>
-      </w:r>
-    </w:p>
-    <w:p>
-      <w:pPr>
-        <w:pStyle w:val="ListParagraph"/>
-        <w:numPr>
-          <w:ilvl w:val="0"/>
-          <w:numId w:val="3"/>
-        </w:numPr>
-      </w:pPr>
-      <w:r>
-        <w:rPr>
-          <w:b/>
-          <w:bCs/>
-        </w:rPr>
-        <w:t>Host.SaveAs</w:t>
-      </w:r>
-      <w:r>
-        <w:rPr>
-          <w:b/>
-          <w:bCs/>
-        </w:rPr>
-        <w:t>DDS_BC7</w:t>
-      </w:r>
-      <w:r>
-        <w:rPr>
-          <w:b/>
-          <w:bCs/>
-        </w:rPr>
-        <w:t>(filename, resourceName</w:t>
-      </w:r>
-      <w:r>
-        <w:rPr>
-          <w:b/>
-          <w:bCs/>
-        </w:rPr>
-        <w:t>, isSRGB=True</w:t>
-      </w:r>
-      <w:r>
-        <w:rPr>
-          <w:b/>
-          <w:bCs/>
-        </w:rPr>
-        <w:t>, arrayindex=-1, mipIndex=-1)</w:t>
-      </w:r>
-      <w:r>
-        <w:t xml:space="preserve"> – This saves a texture resource to a file. If arrayIndex is -1, then each slice and mip level will be written out. Else you are expected to provide a specific arrayIndex and mipIndex.  SetWantReadback() must be called, and the technique must be executed, before you can use this function.</w:t>
-      </w:r>
-    </w:p>
-    <w:p>
-      <w:pPr>
-        <w:pStyle w:val="ListParagraph"/>
-        <w:numPr>
-          <w:ilvl w:val="0"/>
-          <w:numId w:val="3"/>
-        </w:numPr>
-      </w:pPr>
-      <w:r>
-        <w:rPr>
-          <w:b/>
-          <w:bCs/>
-        </w:rPr>
         <w:t>Host.</w:t>
       </w:r>
       <w:r>
@@ -1438,7 +1593,14 @@
           <w:b/>
           <w:bCs/>
         </w:rPr>
-        <w:t>SaveAsEXR</w:t>
+        <w:t>SaveAs</w:t>
+      </w:r>
+      <w:r>
+        <w:rPr>
+          <w:b/>
+          <w:bCs/>
+        </w:rPr>
+        <w:t>CSV</w:t>
       </w:r>
       <w:r>
         <w:rPr>
@@ -1484,7 +1646,7 @@
           <w:b/>
           <w:bCs/>
         </w:rPr>
-        <w:t>HDR</w:t>
+        <w:t>Binary</w:t>
       </w:r>
       <w:r>
         <w:rPr>
@@ -1516,37 +1678,1176 @@
           <w:b/>
           <w:bCs/>
         </w:rPr>
+        <w:t>Host.RunTechnique(count=1)</w:t>
+      </w:r>
+      <w:r>
+        <w:t xml:space="preserve"> – This runs the technique &lt;count&gt; times.</w:t>
+      </w:r>
+    </w:p>
+    <w:p>
+      <w:pPr>
+        <w:pStyle w:val="ListParagraph"/>
+        <w:numPr>
+          <w:ilvl w:val="0"/>
+          <w:numId w:val="3"/>
+        </w:numPr>
+      </w:pPr>
+      <w:r>
+        <w:rPr>
+          <w:b/>
+          <w:bCs/>
+        </w:rPr>
+        <w:t>Host.Log(Level, message)</w:t>
+      </w:r>
+      <w:r>
+        <w:t xml:space="preserve"> – This logs a message to the viewer window. Level can be “Info”, “Warn”, or “Error”. Message needs to be a string.</w:t>
+      </w:r>
+    </w:p>
+    <w:p>
+      <w:pPr>
+        <w:pStyle w:val="ListParagraph"/>
+        <w:numPr>
+          <w:ilvl w:val="0"/>
+          <w:numId w:val="3"/>
+        </w:numPr>
+      </w:pPr>
+      <w:r>
+        <w:rPr>
+          <w:b/>
+          <w:bCs/>
+        </w:rPr>
+        <w:t>Host.Print(message)</w:t>
+      </w:r>
+      <w:r>
+        <w:t xml:space="preserve"> – The same as Host.Log(“Info”, message).</w:t>
+      </w:r>
+    </w:p>
+    <w:p>
+      <w:pPr>
+        <w:pStyle w:val="ListParagraph"/>
+        <w:numPr>
+          <w:ilvl w:val="0"/>
+          <w:numId w:val="3"/>
+        </w:numPr>
+      </w:pPr>
+      <w:r>
+        <w:rPr>
+          <w:b/>
+          <w:bCs/>
+        </w:rPr>
+        <w:t>Host.Warn(message)</w:t>
+      </w:r>
+      <w:r>
+        <w:t xml:space="preserve"> – The same as Host.Log(“Warn”, message).</w:t>
+      </w:r>
+    </w:p>
+    <w:p>
+      <w:pPr>
+        <w:pStyle w:val="ListParagraph"/>
+        <w:numPr>
+          <w:ilvl w:val="0"/>
+          <w:numId w:val="3"/>
+        </w:numPr>
+      </w:pPr>
+      <w:r>
+        <w:rPr>
+          <w:b/>
+          <w:bCs/>
+        </w:rPr>
+        <w:t>Host.Error(message)</w:t>
+      </w:r>
+      <w:r>
+        <w:t xml:space="preserve"> – The same as Host.Log(“Error”, message).</w:t>
+      </w:r>
+    </w:p>
+    <w:p>
+      <w:pPr>
+        <w:pStyle w:val="ListParagraph"/>
+        <w:numPr>
+          <w:ilvl w:val="0"/>
+          <w:numId w:val="3"/>
+        </w:numPr>
+      </w:pPr>
+      <w:r>
+        <w:rPr>
+          <w:b/>
+          <w:bCs/>
+        </w:rPr>
+        <w:t>Host.SetFrameIndex(index)</w:t>
+      </w:r>
+      <w:r>
+        <w:t xml:space="preserve"> – Sets the system variable frame index to a specific value. Useful when the frame index is used as a random number seed or is used in other ways, to be able to set a specific point in time, or just reset back to 0 to restart.</w:t>
+      </w:r>
+    </w:p>
+    <w:p>
+      <w:pPr>
+        <w:pStyle w:val="ListParagraph"/>
+        <w:numPr>
+          <w:ilvl w:val="0"/>
+          <w:numId w:val="3"/>
+        </w:numPr>
+      </w:pPr>
+      <w:r>
+        <w:rPr>
+          <w:b/>
+          <w:bCs/>
+        </w:rPr>
+        <w:t>Host.WaitOnGPU()</w:t>
+      </w:r>
+      <w:r>
+        <w:t xml:space="preserve"> – Waits for all pending GPU work to be finished. It’s best practice to do this before a readback, to make sure you are getting the data you think you are.</w:t>
+      </w:r>
+    </w:p>
+    <w:p>
+      <w:pPr>
+        <w:pStyle w:val="ListParagraph"/>
+        <w:numPr>
+          <w:ilvl w:val="0"/>
+          <w:numId w:val="3"/>
+        </w:numPr>
+      </w:pPr>
+      <w:r>
+        <w:rPr>
+          <w:b/>
+          <w:bCs/>
+        </w:rPr>
+        <w:t>Host.Pause(pause)</w:t>
+      </w:r>
+      <w:r>
+        <w:t xml:space="preserve"> – Pause or unpause execution of the technique in the viewer. Does not effect Host.RunTechnique.</w:t>
+      </w:r>
+    </w:p>
+    <w:p>
+      <w:pPr>
+        <w:pStyle w:val="ListParagraph"/>
+        <w:numPr>
+          <w:ilvl w:val="0"/>
+          <w:numId w:val="3"/>
+        </w:numPr>
+      </w:pPr>
+      <w:r>
+        <w:rPr>
+          <w:b/>
+          <w:bCs/>
+        </w:rPr>
+        <w:t>Host.PixCaptureNextFrames(filename, frames = 1)</w:t>
+      </w:r>
+      <w:r>
+        <w:t xml:space="preserve"> – Causes a pix capture to be taken. If it wants N frames to be captured, you must run the technique that many times, or return control to the user to allow that many frames to be rendered.</w:t>
+      </w:r>
+    </w:p>
+    <w:p>
+      <w:pPr>
+        <w:pStyle w:val="ListParagraph"/>
+        <w:numPr>
+          <w:ilvl w:val="0"/>
+          <w:numId w:val="3"/>
+        </w:numPr>
+      </w:pPr>
+      <w:r>
+        <w:rPr>
+          <w:b/>
+          <w:bCs/>
+        </w:rPr>
+        <w:t>Host.GetImportedBufferBounds(importedBufferName)</w:t>
+      </w:r>
+      <w:r>
+        <w:t xml:space="preserve"> – If this buffer has a field which has a position semantic, this will return the min and max bounding box of the buffer positions.</w:t>
+      </w:r>
+    </w:p>
+    <w:p>
+      <w:pPr>
+        <w:pStyle w:val="ListParagraph"/>
+        <w:numPr>
+          <w:ilvl w:val="0"/>
+          <w:numId w:val="3"/>
+        </w:numPr>
+      </w:pPr>
+      <w:r>
+        <w:rPr>
+          <w:b/>
+          <w:bCs/>
+        </w:rPr>
+        <w:t>Host.SetImported</w:t>
+      </w:r>
+      <w:r>
+        <w:rPr>
+          <w:b/>
+          <w:bCs/>
+        </w:rPr>
+        <w:t>Buffer</w:t>
+      </w:r>
+      <w:r>
+        <w:rPr>
+          <w:b/>
+          <w:bCs/>
+        </w:rPr>
+        <w:t>File(imported</w:t>
+      </w:r>
+      <w:r>
+        <w:rPr>
+          <w:b/>
+          <w:bCs/>
+        </w:rPr>
+        <w:t>Buffer</w:t>
+      </w:r>
+      <w:r>
+        <w:rPr>
+          <w:b/>
+          <w:bCs/>
+        </w:rPr>
+        <w:t>Name, fileName)</w:t>
+      </w:r>
+      <w:r>
+        <w:t xml:space="preserve"> – Sets the filename of an imported buffer.</w:t>
+      </w:r>
+    </w:p>
+    <w:p>
+      <w:pPr>
+        <w:pStyle w:val="ListParagraph"/>
+        <w:numPr>
+          <w:ilvl w:val="0"/>
+          <w:numId w:val="3"/>
+        </w:numPr>
+      </w:pPr>
+      <w:r>
+        <w:rPr>
+          <w:b/>
+          <w:bCs/>
+        </w:rPr>
+        <w:t>Host.SetImported</w:t>
+      </w:r>
+      <w:r>
+        <w:rPr>
+          <w:b/>
+          <w:bCs/>
+        </w:rPr>
+        <w:t>BufferStruct</w:t>
+      </w:r>
+      <w:r>
+        <w:rPr>
+          <w:b/>
+          <w:bCs/>
+        </w:rPr>
+        <w:t>(imported</w:t>
+      </w:r>
+      <w:r>
+        <w:rPr>
+          <w:b/>
+          <w:bCs/>
+        </w:rPr>
+        <w:t>Buffer</w:t>
+      </w:r>
+      <w:r>
+        <w:rPr>
+          <w:b/>
+          <w:bCs/>
+        </w:rPr>
+        <w:t xml:space="preserve">Name, </w:t>
+      </w:r>
+      <w:r>
+        <w:rPr>
+          <w:b/>
+          <w:bCs/>
+        </w:rPr>
+        <w:t>structName</w:t>
+      </w:r>
+      <w:r>
+        <w:rPr>
+          <w:b/>
+          <w:bCs/>
+        </w:rPr>
+        <w:t>)</w:t>
+      </w:r>
+      <w:r>
+        <w:t xml:space="preserve"> – Sets the buffer’s type to be a specific struct type.</w:t>
+      </w:r>
+    </w:p>
+    <w:p>
+      <w:pPr>
+        <w:pStyle w:val="ListParagraph"/>
+        <w:numPr>
+          <w:ilvl w:val="0"/>
+          <w:numId w:val="3"/>
+        </w:numPr>
+      </w:pPr>
+      <w:r>
+        <w:rPr>
+          <w:b/>
+          <w:bCs/>
+        </w:rPr>
+        <w:t>Host.SetImported</w:t>
+      </w:r>
+      <w:r>
+        <w:rPr>
+          <w:b/>
+          <w:bCs/>
+        </w:rPr>
+        <w:t>BufferCount</w:t>
+      </w:r>
+      <w:r>
+        <w:rPr>
+          <w:b/>
+          <w:bCs/>
+        </w:rPr>
+        <w:t>(imported</w:t>
+      </w:r>
+      <w:r>
+        <w:rPr>
+          <w:b/>
+          <w:bCs/>
+        </w:rPr>
+        <w:t>Buffer</w:t>
+      </w:r>
+      <w:r>
+        <w:rPr>
+          <w:b/>
+          <w:bCs/>
+        </w:rPr>
+        <w:t xml:space="preserve">Name, </w:t>
+      </w:r>
+      <w:r>
+        <w:rPr>
+          <w:b/>
+          <w:bCs/>
+        </w:rPr>
+        <w:t>type</w:t>
+      </w:r>
+      <w:r>
+        <w:rPr>
+          <w:b/>
+          <w:bCs/>
+        </w:rPr>
+        <w:t>)</w:t>
+      </w:r>
+      <w:r>
+        <w:t xml:space="preserve"> – Sets the buffer’s type to be a POD (non struct) type. Uses Host.</w:t>
+      </w:r>
+      <w:r>
+        <w:t>DataFieldType</w:t>
+      </w:r>
+      <w:r>
+        <w:t xml:space="preserve"> enum.  See PythonTypes.txt for more info.</w:t>
+      </w:r>
+    </w:p>
+    <w:p>
+      <w:pPr>
+        <w:pStyle w:val="ListParagraph"/>
+        <w:numPr>
+          <w:ilvl w:val="0"/>
+          <w:numId w:val="3"/>
+        </w:numPr>
+      </w:pPr>
+      <w:r>
+        <w:rPr>
+          <w:b/>
+          <w:bCs/>
+        </w:rPr>
+        <w:t>Host.SetImported</w:t>
+      </w:r>
+      <w:r>
+        <w:rPr>
+          <w:b/>
+          <w:bCs/>
+        </w:rPr>
+        <w:t>Buffer</w:t>
+      </w:r>
+      <w:r>
+        <w:rPr>
+          <w:b/>
+          <w:bCs/>
+        </w:rPr>
+        <w:t xml:space="preserve">CSVHeaderRow </w:t>
+      </w:r>
+      <w:r>
+        <w:rPr>
+          <w:b/>
+          <w:bCs/>
+        </w:rPr>
+        <w:t>(imported</w:t>
+      </w:r>
+      <w:r>
+        <w:rPr>
+          <w:b/>
+          <w:bCs/>
+        </w:rPr>
+        <w:t>Buffer</w:t>
+      </w:r>
+      <w:r>
+        <w:rPr>
+          <w:b/>
+          <w:bCs/>
+        </w:rPr>
+        <w:t xml:space="preserve">Name, </w:t>
+      </w:r>
+      <w:r>
+        <w:rPr>
+          <w:b/>
+          <w:bCs/>
+        </w:rPr>
+        <w:t>CSVHeaderRow</w:t>
+      </w:r>
+      <w:r>
+        <w:rPr>
+          <w:b/>
+          <w:bCs/>
+        </w:rPr>
+        <w:t>)</w:t>
+      </w:r>
+      <w:r>
+        <w:t xml:space="preserve"> – Sets whether or not the buffer’s csv file has a header row.</w:t>
+      </w:r>
+    </w:p>
+    <w:p>
+      <w:pPr>
+        <w:pStyle w:val="ListParagraph"/>
+        <w:numPr>
+          <w:ilvl w:val="0"/>
+          <w:numId w:val="3"/>
+        </w:numPr>
+      </w:pPr>
+      <w:r>
+        <w:rPr>
+          <w:b/>
+          <w:bCs/>
+        </w:rPr>
+        <w:t>Host.SetImported</w:t>
+      </w:r>
+      <w:r>
+        <w:rPr>
+          <w:b/>
+          <w:bCs/>
+        </w:rPr>
+        <w:t>BufferCount</w:t>
+      </w:r>
+      <w:r>
+        <w:rPr>
+          <w:b/>
+          <w:bCs/>
+        </w:rPr>
+        <w:t>(imported</w:t>
+      </w:r>
+      <w:r>
+        <w:rPr>
+          <w:b/>
+          <w:bCs/>
+        </w:rPr>
+        <w:t>Buffer</w:t>
+      </w:r>
+      <w:r>
+        <w:rPr>
+          <w:b/>
+          <w:bCs/>
+        </w:rPr>
+        <w:t xml:space="preserve">Name, </w:t>
+      </w:r>
+      <w:r>
+        <w:rPr>
+          <w:b/>
+          <w:bCs/>
+        </w:rPr>
+        <w:t>count</w:t>
+      </w:r>
+      <w:r>
+        <w:rPr>
+          <w:b/>
+          <w:bCs/>
+        </w:rPr>
+        <w:t>)</w:t>
+      </w:r>
+      <w:r>
+        <w:t xml:space="preserve"> – Sets how many items are in the buffer.</w:t>
+      </w:r>
+    </w:p>
+    <w:p>
+      <w:pPr>
+        <w:pStyle w:val="ListParagraph"/>
+        <w:numPr>
+          <w:ilvl w:val="0"/>
+          <w:numId w:val="3"/>
+        </w:numPr>
+      </w:pPr>
+      <w:r>
+        <w:rPr>
+          <w:b/>
+          <w:bCs/>
+        </w:rPr>
         <w:t>Host.</w:t>
       </w:r>
       <w:r>
         <w:rPr>
           <w:b/>
           <w:bCs/>
-        </w:rPr>
-        <w:t>SaveAs</w:t>
-      </w:r>
-      <w:r>
-        <w:rPr>
-          <w:b/>
-          <w:bCs/>
-        </w:rPr>
-        <w:t>CSV</w:t>
-      </w:r>
-      <w:r>
-        <w:rPr>
-          <w:b/>
-          <w:bCs/>
-        </w:rPr>
-        <w:t>(filename, resourceName, arrayindex=-1, mipIndex=-1)</w:t>
-      </w:r>
-      <w:r>
-        <w:t xml:space="preserve"> – This saves a texture resource to a</w:t>
+          <w:lang w:val="en-US"/>
+        </w:rPr>
+        <w:t>SetImportedBufferMaterialShaderFile(</w:t>
+      </w:r>
+      <w:r>
+        <w:rPr>
+          <w:b/>
+          <w:bCs/>
+        </w:rPr>
+        <w:t>importedBufferName, fileName</w:t>
+      </w:r>
+      <w:r>
+        <w:rPr>
+          <w:b/>
+          <w:bCs/>
+          <w:lang w:val="en-US"/>
+        </w:rPr>
+        <w:t>)</w:t>
+      </w:r>
+      <w:r>
+        <w:rPr>
+          <w:lang w:val="en-US"/>
+        </w:rPr>
+        <w:t xml:space="preserve"> – If an imported buffer has a data stream of “Material”, this specifies the file to write for the generated material shader function.</w:t>
+      </w:r>
+    </w:p>
+    <w:p>
+      <w:pPr>
+        <w:pStyle w:val="ListParagraph"/>
+        <w:numPr>
+          <w:ilvl w:val="0"/>
+          <w:numId w:val="3"/>
+        </w:numPr>
+      </w:pPr>
+      <w:r>
+        <w:rPr>
+          <w:b/>
+          <w:bCs/>
+        </w:rPr>
+        <w:t>Host.SetImportedTextureFile(importedTextureName, fileName)</w:t>
+      </w:r>
+      <w:r>
+        <w:t xml:space="preserve"> – Sets the filename of an imported texture.</w:t>
+      </w:r>
+    </w:p>
+    <w:p>
+      <w:pPr>
+        <w:pStyle w:val="ListParagraph"/>
+        <w:numPr>
+          <w:ilvl w:val="0"/>
+          <w:numId w:val="3"/>
+        </w:numPr>
+      </w:pPr>
+      <w:r>
+        <w:rPr>
+          <w:b/>
+          <w:bCs/>
+        </w:rPr>
+        <w:t>Host.SetImportedTextureSourceIsSRGB(importedTextureName, sourceisSRGB)</w:t>
+      </w:r>
+      <w:r>
+        <w:t xml:space="preserve"> – Sets whether or not the source texture is SRGB.</w:t>
+      </w:r>
+    </w:p>
+    <w:p>
+      <w:pPr>
+        <w:pStyle w:val="ListParagraph"/>
+        <w:numPr>
+          <w:ilvl w:val="0"/>
+          <w:numId w:val="3"/>
+        </w:numPr>
+      </w:pPr>
+      <w:r>
+        <w:rPr>
+          <w:b/>
+          <w:bCs/>
+        </w:rPr>
+        <w:lastRenderedPageBreak/>
+        <w:t>Host.SetImportedTextureMakeMips(importedTextureName, makeMips)</w:t>
+      </w:r>
+      <w:r>
+        <w:t xml:space="preserve"> – Sets whether or not to make mips for the imported texture.</w:t>
+      </w:r>
+    </w:p>
+    <w:p>
+      <w:pPr>
+        <w:pStyle w:val="ListParagraph"/>
+        <w:numPr>
+          <w:ilvl w:val="0"/>
+          <w:numId w:val="3"/>
+        </w:numPr>
+      </w:pPr>
+      <w:r>
+        <w:rPr>
+          <w:b/>
+          <w:bCs/>
+        </w:rPr>
+        <w:t>Host.</w:t>
+      </w:r>
+      <w:r>
+        <w:rPr>
+          <w:b/>
+          <w:bCs/>
+        </w:rPr>
+        <w:t>SetImportedTextureFormat(importedTextureName, format)</w:t>
+      </w:r>
+      <w:r>
+        <w:t xml:space="preserve"> – Sets the format of an imported texture. The importedTextureName is the name of the texture in the “Imported Resources” window. The format is specified using the enum Host.TextureFormat.  Append the format you see in the drop down to Host.TextureFormat, such as </w:t>
+      </w:r>
+      <w:r>
+        <w:t>Host.TextureFormat_RGBA32_Float</w:t>
+      </w:r>
+      <w:r>
+        <w:t>.</w:t>
+      </w:r>
+    </w:p>
+    <w:p>
+      <w:pPr>
+        <w:pStyle w:val="ListParagraph"/>
+        <w:numPr>
+          <w:ilvl w:val="0"/>
+          <w:numId w:val="3"/>
+        </w:numPr>
+      </w:pPr>
+      <w:r>
+        <w:rPr>
+          <w:b/>
+          <w:bCs/>
+        </w:rPr>
+        <w:t>Host.SetImportedTextureColor(importedTextureName, R, G, B, A)</w:t>
+      </w:r>
+      <w:r>
+        <w:t xml:space="preserve"> – Sets the color of an imported texture.</w:t>
+      </w:r>
+    </w:p>
+    <w:p>
+      <w:pPr>
+        <w:pStyle w:val="ListParagraph"/>
+        <w:numPr>
+          <w:ilvl w:val="0"/>
+          <w:numId w:val="3"/>
+        </w:numPr>
+      </w:pPr>
+      <w:r>
+        <w:rPr>
+          <w:b/>
+          <w:bCs/>
+        </w:rPr>
+        <w:t>Host.SetImportedTextureSize(importedTextureName, x, y, z)</w:t>
+      </w:r>
+      <w:r>
+        <w:t xml:space="preserve"> – Set the size of an imported texture. The importedTextureName is the name of the texture in the “Imported Resources” window. x,y,z should be integers.</w:t>
+      </w:r>
+      <w:r>
+        <w:t xml:space="preserve">  For a 2D texture, set z to 1, not 0.</w:t>
+      </w:r>
+    </w:p>
+    <w:p>
+      <w:pPr>
+        <w:pStyle w:val="ListParagraph"/>
+        <w:numPr>
+          <w:ilvl w:val="0"/>
+          <w:numId w:val="3"/>
+        </w:numPr>
+      </w:pPr>
+      <w:r>
+        <w:rPr>
+          <w:b/>
+          <w:bCs/>
+        </w:rPr>
+        <w:t>Host.SetImportedTexture</w:t>
+      </w:r>
+      <w:r>
+        <w:rPr>
+          <w:b/>
+          <w:bCs/>
+        </w:rPr>
+        <w:t>Binary</w:t>
+      </w:r>
+      <w:r>
+        <w:rPr>
+          <w:b/>
+          <w:bCs/>
+        </w:rPr>
+        <w:t>Size(importedTextureName, x, y, z)</w:t>
+      </w:r>
+      <w:r>
+        <w:t xml:space="preserve"> – Set the size of an imported texture if it’s a binary file. The importedTextureName is the name of the texture in the “Imported Resources” window. x,y,z should be integers.  For a 2D texture, set z to 1, not 0.</w:t>
+      </w:r>
+    </w:p>
+    <w:p>
+      <w:pPr>
+        <w:pStyle w:val="ListParagraph"/>
+        <w:numPr>
+          <w:ilvl w:val="0"/>
+          <w:numId w:val="3"/>
+        </w:numPr>
+      </w:pPr>
+      <w:r>
+        <w:rPr>
+          <w:b/>
+          <w:bCs/>
+        </w:rPr>
+        <w:t>Host.SetImportedTexture</w:t>
+      </w:r>
+      <w:r>
+        <w:rPr>
+          <w:b/>
+          <w:bCs/>
+        </w:rPr>
+        <w:t>Binary</w:t>
+      </w:r>
+      <w:r>
+        <w:rPr>
+          <w:b/>
+          <w:bCs/>
+        </w:rPr>
+        <w:t>Format(importedTextureName, format)</w:t>
+      </w:r>
+      <w:r>
+        <w:t xml:space="preserve"> – Sets the format of the binary file being loaded for the imported texture.</w:t>
+      </w:r>
+    </w:p>
+    <w:p>
+      <w:pPr>
+        <w:pStyle w:val="ListParagraph"/>
+        <w:numPr>
+          <w:ilvl w:val="0"/>
+          <w:numId w:val="3"/>
+        </w:numPr>
+      </w:pPr>
+      <w:r>
+        <w:rPr>
+          <w:b/>
+          <w:bCs/>
+        </w:rPr>
+        <w:t>Host.SetFrameDeltaTime(</w:t>
+      </w:r>
+      <w:r>
+        <w:rPr>
+          <w:b/>
+          <w:bCs/>
+        </w:rPr>
+        <w:t>deltaTime</w:t>
+      </w:r>
+      <w:r>
+        <w:rPr>
+          <w:b/>
+          <w:bCs/>
+        </w:rPr>
+        <w:t>)</w:t>
+      </w:r>
+      <w:r>
+        <w:t xml:space="preserve"> – in seconds. This sets the system variable for the frame delta time to a fixed value. Useful if wanting to record a video. Set to &lt;= 0 to clear the forced delta time.</w:t>
+      </w:r>
+    </w:p>
+    <w:p>
+      <w:pPr>
+        <w:pStyle w:val="ListParagraph"/>
+        <w:numPr>
+          <w:ilvl w:val="0"/>
+          <w:numId w:val="3"/>
+        </w:numPr>
+      </w:pPr>
+      <w:r>
+        <w:rPr>
+          <w:b/>
+          <w:bCs/>
+        </w:rPr>
+        <w:t>Host.</w:t>
+      </w:r>
+      <w:r>
+        <w:rPr>
+          <w:b/>
+          <w:bCs/>
+        </w:rPr>
+        <w:t>SetCameraPos(x,y,z)</w:t>
+      </w:r>
+      <w:r>
+        <w:t xml:space="preserve"> – set the position of the camera.</w:t>
+      </w:r>
+    </w:p>
+    <w:p>
+      <w:pPr>
+        <w:pStyle w:val="ListParagraph"/>
+        <w:numPr>
+          <w:ilvl w:val="0"/>
+          <w:numId w:val="3"/>
+        </w:numPr>
+      </w:pPr>
+      <w:r>
+        <w:rPr>
+          <w:b/>
+          <w:bCs/>
+        </w:rPr>
+        <w:t>Host.SetCameraFOV(fov)</w:t>
+      </w:r>
+      <w:r>
+        <w:t xml:space="preserve"> – sets the FOV of the camera.</w:t>
+      </w:r>
+    </w:p>
+    <w:p>
+      <w:pPr>
+        <w:pStyle w:val="ListParagraph"/>
+        <w:numPr>
+          <w:ilvl w:val="0"/>
+          <w:numId w:val="3"/>
+        </w:numPr>
+      </w:pPr>
+      <w:r>
+        <w:rPr>
+          <w:b/>
+          <w:bCs/>
+        </w:rPr>
+        <w:t>Host.SetCameraAltitudeAzimuth(altitude, azimuth)</w:t>
+      </w:r>
+      <w:r>
+        <w:t xml:space="preserve"> – in radians. We should add a “look at” function and similar to make working with the camera easier.</w:t>
+      </w:r>
+    </w:p>
+    <w:p>
+      <w:pPr>
+        <w:pStyle w:val="ListParagraph"/>
+        <w:numPr>
+          <w:ilvl w:val="0"/>
+          <w:numId w:val="3"/>
+        </w:numPr>
+      </w:pPr>
+      <w:r>
+        <w:rPr>
+          <w:b/>
+          <w:bCs/>
+        </w:rPr>
+        <w:t>Host.</w:t>
+      </w:r>
+      <w:r>
+        <w:rPr>
+          <w:b/>
+          <w:bCs/>
+          <w:lang w:val="en-US"/>
+        </w:rPr>
+        <w:t>SetCameraNearFarZ(nearZ, farZ)</w:t>
+      </w:r>
+      <w:r>
+        <w:rPr>
+          <w:lang w:val="en-US"/>
+        </w:rPr>
+        <w:t xml:space="preserve"> – sets the near and far plane of the camera</w:t>
+      </w:r>
+    </w:p>
+    <w:p>
+      <w:pPr>
+        <w:pStyle w:val="ListParagraph"/>
+        <w:numPr>
+          <w:ilvl w:val="0"/>
+          <w:numId w:val="3"/>
+        </w:numPr>
+      </w:pPr>
+      <w:r>
+        <w:rPr>
+          <w:b/>
+          <w:bCs/>
+        </w:rPr>
+        <w:t>Host.</w:t>
+      </w:r>
+      <w:r>
+        <w:rPr>
+          <w:b/>
+          <w:bCs/>
+          <w:lang w:val="en-US"/>
+        </w:rPr>
+        <w:t>SetCameraFlySpeed(speed)</w:t>
+      </w:r>
+      <w:r>
+        <w:rPr>
+          <w:lang w:val="en-US"/>
+        </w:rPr>
+        <w:t xml:space="preserve"> – sets the fly speed of the camera</w:t>
+      </w:r>
+    </w:p>
+    <w:p>
+      <w:pPr>
+        <w:pStyle w:val="ListParagraph"/>
+        <w:numPr>
+          <w:ilvl w:val="0"/>
+          <w:numId w:val="3"/>
+        </w:numPr>
+      </w:pPr>
+      <w:r>
+        <w:rPr>
+          <w:b/>
+          <w:bCs/>
+        </w:rPr>
+        <w:t>Host.GetCameraPos()</w:t>
+      </w:r>
+      <w:r>
+        <w:t xml:space="preserve"> – returns the x,y,z position of the camera</w:t>
+      </w:r>
+    </w:p>
+    <w:p>
+      <w:pPr>
+        <w:pStyle w:val="ListParagraph"/>
+        <w:numPr>
+          <w:ilvl w:val="0"/>
+          <w:numId w:val="3"/>
+        </w:numPr>
+      </w:pPr>
+      <w:r>
+        <w:rPr>
+          <w:b/>
+          <w:bCs/>
+        </w:rPr>
+        <w:t>Host.GetCameraAltitudeAzimuth()</w:t>
+      </w:r>
+      <w:r>
+        <w:t xml:space="preserve"> – returns the altitude and azimuth of the camera. In radians.</w:t>
+      </w:r>
+    </w:p>
+    <w:p>
+      <w:pPr>
+        <w:pStyle w:val="ListParagraph"/>
+        <w:numPr>
+          <w:ilvl w:val="0"/>
+          <w:numId w:val="3"/>
+        </w:numPr>
+      </w:pPr>
+      <w:r>
+        <w:rPr>
+          <w:b/>
+          <w:bCs/>
+        </w:rPr>
+        <w:t>Host.</w:t>
+      </w:r>
+      <w:r>
+        <w:rPr>
+          <w:b/>
+          <w:bCs/>
+        </w:rPr>
+        <w:t>WriteGPUResource(name, value, subresourceIndex = 0)</w:t>
       </w:r>
       <w:r>
         <w:t xml:space="preserve"> </w:t>
       </w:r>
       <w:r>
-        <w:t>file. If arrayIndex is -1, then each slice and mip level will be written out. Else you are expected to provide a specific arrayIndex and mipIndex.  SetWantReadback() must be called, and the technique must be executed, before you can use this function.</w:t>
+        <w:t>–</w:t>
+      </w:r>
+      <w:r>
+        <w:t xml:space="preserve"> </w:t>
+      </w:r>
+      <w:r>
+        <w:t xml:space="preserve">This causes a gpu resource to be written the next time the technique is executed.  </w:t>
+      </w:r>
+      <w:r>
+        <w:t>The name is the name shown at the top of the resource viewer, such as “</w:t>
+      </w:r>
+      <w:r>
+        <w:t>Node_1.output: Output (UAV - After)</w:t>
+      </w:r>
+      <w:r>
+        <w:t>”. While those names are a mouth full, they uniquely identify the resource to write, as well as what part of the rendering timeline to write the value.  There is a “copy to clipboard” button next to the name for your convenience. The value is expected to be a bytes object that is the same size as the destination resource. The subresourceIndex is only used by texture2darrays, where it is the array index.</w:t>
+      </w:r>
+    </w:p>
+    <w:p>
+      <w:pPr>
+        <w:pStyle w:val="ListParagraph"/>
+        <w:numPr>
+          <w:ilvl w:val="0"/>
+          <w:numId w:val="3"/>
+        </w:numPr>
+      </w:pPr>
+      <w:r>
+        <w:rPr>
+          <w:b/>
+          <w:bCs/>
+        </w:rPr>
+        <w:t>Host.ForceEnableProfiling(set=True)</w:t>
+      </w:r>
+      <w:r>
+        <w:t xml:space="preserve"> – Let the viewer know about your intent to read profiling data. must be called before calling Host.</w:t>
+      </w:r>
+      <w:r>
+        <w:t>GetProfilingData</w:t>
+      </w:r>
+      <w:r>
+        <w:t>(). Profiling data is not available until the technique is executed.</w:t>
+      </w:r>
+    </w:p>
+    <w:p>
+      <w:pPr>
+        <w:pStyle w:val="ListParagraph"/>
+        <w:numPr>
+          <w:ilvl w:val="0"/>
+          <w:numId w:val="3"/>
+        </w:numPr>
+      </w:pPr>
+      <w:r>
+        <w:rPr>
+          <w:b/>
+          <w:bCs/>
+        </w:rPr>
+        <w:t>Host.GetProfilingData()</w:t>
+      </w:r>
+      <w:r>
+        <w:t xml:space="preserve"> – Returns a dictionary mapping render graph node names to an array which contains the cpu and gpu timing in milliseconds, respectively.  Also contains a “total”.</w:t>
+      </w:r>
+    </w:p>
+    <w:p>
+      <w:pPr>
+        <w:pStyle w:val="ListParagraph"/>
+        <w:numPr>
+          <w:ilvl w:val="0"/>
+          <w:numId w:val="3"/>
+        </w:numPr>
+      </w:pPr>
+      <w:r>
+        <w:rPr>
+          <w:b/>
+          <w:bCs/>
+        </w:rPr>
+        <w:t>Host.IsResourceCreated(nodeName)</w:t>
+      </w:r>
+      <w:r>
+        <w:t xml:space="preserve"> – Returns whether the resource node specified has its resource created or not. Takes a node name, not a resource name.</w:t>
+      </w:r>
+    </w:p>
+    <w:p>
+      <w:pPr>
+        <w:pStyle w:val="ListParagraph"/>
+        <w:numPr>
+          <w:ilvl w:val="0"/>
+          <w:numId w:val="3"/>
+        </w:numPr>
+      </w:pPr>
+      <w:r>
+        <w:rPr>
+          <w:b/>
+          <w:bCs/>
+        </w:rPr>
+        <w:lastRenderedPageBreak/>
+        <w:t>Host.SetViewedResource(resourceName)</w:t>
+      </w:r>
+      <w:r>
+        <w:t xml:space="preserve"> – Makes the viewer view the specified resource name.  This is the same resource name you see in the viewer, such as “Input – Initial State”, not the node name.</w:t>
+      </w:r>
+    </w:p>
+    <w:p>
+      <w:pPr>
+        <w:pStyle w:val="ListParagraph"/>
+        <w:numPr>
+          <w:ilvl w:val="0"/>
+          <w:numId w:val="3"/>
+        </w:numPr>
+      </w:pPr>
+      <w:r>
+        <w:rPr>
+          <w:b/>
+          <w:bCs/>
+        </w:rPr>
+        <w:t>Host</w:t>
+      </w:r>
+      <w:r>
+        <w:rPr>
+          <w:b/>
+          <w:bCs/>
+        </w:rPr>
+        <w:t xml:space="preserve">.GGEnumValue(enumName, enumLabel) </w:t>
+      </w:r>
+      <w:r>
+        <w:t>– This returns the integer value of the enum label within the enum name given.</w:t>
+      </w:r>
+    </w:p>
+    <w:p>
+      <w:pPr>
+        <w:pStyle w:val="ListParagraph"/>
+        <w:numPr>
+          <w:ilvl w:val="0"/>
+          <w:numId w:val="3"/>
+        </w:numPr>
+      </w:pPr>
+      <w:r>
+        <w:rPr>
+          <w:b/>
+          <w:bCs/>
+        </w:rPr>
+        <w:t>Host.GGEnumLabel(enumName, value)</w:t>
+      </w:r>
+      <w:r>
+        <w:t xml:space="preserve"> – This returns the string label of the integer value in the enum.</w:t>
+      </w:r>
+    </w:p>
+    <w:p>
+      <w:pPr>
+        <w:pStyle w:val="ListParagraph"/>
+        <w:numPr>
+          <w:ilvl w:val="0"/>
+          <w:numId w:val="3"/>
+        </w:numPr>
+      </w:pPr>
+      <w:r>
+        <w:rPr>
+          <w:b/>
+          <w:bCs/>
+        </w:rPr>
+        <w:t>Host</w:t>
+      </w:r>
+      <w:r>
+        <w:rPr>
+          <w:b/>
+          <w:bCs/>
+        </w:rPr>
+        <w:t>.GGEnumCount(enumName)</w:t>
+      </w:r>
+      <w:r>
+        <w:t xml:space="preserve"> – Returns an integer count of how many items there are in the enum.</w:t>
+      </w:r>
+    </w:p>
+    <w:p>
+      <w:pPr>
+        <w:pStyle w:val="ListParagraph"/>
+        <w:numPr>
+          <w:ilvl w:val="0"/>
+          <w:numId w:val="3"/>
+        </w:numPr>
+      </w:pPr>
+      <w:r>
+        <w:rPr>
+          <w:b/>
+          <w:bCs/>
+        </w:rPr>
+        <w:t>Host.GetGPUString()</w:t>
+      </w:r>
+      <w:r>
+        <w:t xml:space="preserve"> – Returns a string with the GPU name and driver version.</w:t>
+      </w:r>
+    </w:p>
+    <w:p>
+      <w:pPr>
+        <w:pStyle w:val="ListParagraph"/>
+        <w:numPr>
+          <w:ilvl w:val="0"/>
+          <w:numId w:val="3"/>
+        </w:numPr>
+      </w:pPr>
+      <w:r>
+        <w:rPr>
+          <w:b/>
+          <w:bCs/>
+        </w:rPr>
+        <w:t>Host.SetShaderAssertsLogging(value)</w:t>
+      </w:r>
+      <w:r>
+        <w:t xml:space="preserve"> - </w:t>
+      </w:r>
+      <w:r>
+        <w:rPr>
+          <w:lang w:val="en-US"/>
+        </w:rPr>
+        <w:t>Toggles auto error logging of the collected shader asserts after a technique execution.</w:t>
+      </w:r>
+      <w:r>
+        <w:rPr>
+          <w:lang w:val="en-US"/>
+        </w:rPr>
+        <w:t xml:space="preserve"> Value is </w:t>
+      </w:r>
+      <w:r>
+        <w:rPr>
+          <w:lang w:val="en-US"/>
+        </w:rPr>
+        <w:t>Boolean.</w:t>
       </w:r>
     </w:p>
     <w:p>
@@ -1568,202 +2869,27 @@
         <w:rPr>
           <w:b/>
           <w:bCs/>
-        </w:rPr>
-        <w:t>SaveAs</w:t>
-      </w:r>
-      <w:r>
-        <w:rPr>
-          <w:b/>
-          <w:bCs/>
-        </w:rPr>
-        <w:t>Binary</w:t>
-      </w:r>
-      <w:r>
-        <w:rPr>
-          <w:b/>
-          <w:bCs/>
-        </w:rPr>
-        <w:t>(filename, resourceName, arrayindex=-1, mipIndex=-1)</w:t>
-      </w:r>
-      <w:r>
-        <w:t xml:space="preserve"> – This saves a texture resource to a</w:t>
-      </w:r>
-      <w:r>
+          <w:lang w:val="en-US"/>
+        </w:rPr>
+        <w:t>GetCollectedShaderAssertsCount()</w:t>
+      </w:r>
+      <w:r>
+        <w:rPr>
+          <w:lang w:val="en-US"/>
+        </w:rPr>
         <w:t xml:space="preserve"> </w:t>
       </w:r>
       <w:r>
-        <w:t>file. If arrayIndex is -1, then each slice and mip level will be written out. Else you are expected to provide a specific arrayIndex and mipIndex.  SetWantReadback() must be called, and the technique must be executed, before you can use this function.</w:t>
-      </w:r>
-    </w:p>
-    <w:p>
-      <w:pPr>
-        <w:pStyle w:val="ListParagraph"/>
-        <w:numPr>
-          <w:ilvl w:val="0"/>
-          <w:numId w:val="3"/>
-        </w:numPr>
-      </w:pPr>
-      <w:r>
-        <w:rPr>
-          <w:b/>
-          <w:bCs/>
-        </w:rPr>
-        <w:t>Host.RunTechnique(count=1)</w:t>
-      </w:r>
-      <w:r>
-        <w:t xml:space="preserve"> – This runs the technique &lt;count&gt; times.</w:t>
-      </w:r>
-    </w:p>
-    <w:p>
-      <w:pPr>
-        <w:pStyle w:val="ListParagraph"/>
-        <w:numPr>
-          <w:ilvl w:val="0"/>
-          <w:numId w:val="3"/>
-        </w:numPr>
-      </w:pPr>
-      <w:r>
-        <w:rPr>
-          <w:b/>
-          <w:bCs/>
-        </w:rPr>
-        <w:t>Host.Log(Level, message)</w:t>
-      </w:r>
-      <w:r>
-        <w:t xml:space="preserve"> – This logs a message to the viewer window. Level can be “Info”, “Warn”, or “Error”. Message needs to be a string.</w:t>
-      </w:r>
-    </w:p>
-    <w:p>
-      <w:pPr>
-        <w:pStyle w:val="ListParagraph"/>
-        <w:numPr>
-          <w:ilvl w:val="0"/>
-          <w:numId w:val="3"/>
-        </w:numPr>
-      </w:pPr>
-      <w:r>
-        <w:rPr>
-          <w:b/>
-          <w:bCs/>
-        </w:rPr>
-        <w:t>Host.Print(message)</w:t>
-      </w:r>
-      <w:r>
-        <w:t xml:space="preserve"> – The same as Host.Log(“Info”, message).</w:t>
-      </w:r>
-    </w:p>
-    <w:p>
-      <w:pPr>
-        <w:pStyle w:val="ListParagraph"/>
-        <w:numPr>
-          <w:ilvl w:val="0"/>
-          <w:numId w:val="3"/>
-        </w:numPr>
-      </w:pPr>
-      <w:r>
-        <w:rPr>
-          <w:b/>
-          <w:bCs/>
-        </w:rPr>
-        <w:t>Host.Warn(message)</w:t>
-      </w:r>
-      <w:r>
-        <w:t xml:space="preserve"> – The same as Host.Log(“Warn”, message).</w:t>
-      </w:r>
-    </w:p>
-    <w:p>
-      <w:pPr>
-        <w:pStyle w:val="ListParagraph"/>
-        <w:numPr>
-          <w:ilvl w:val="0"/>
-          <w:numId w:val="3"/>
-        </w:numPr>
-      </w:pPr>
-      <w:r>
-        <w:rPr>
-          <w:b/>
-          <w:bCs/>
-        </w:rPr>
-        <w:t>Host.Error(message)</w:t>
-      </w:r>
-      <w:r>
-        <w:t xml:space="preserve"> – The same as Host.Log(“Error”, message).</w:t>
-      </w:r>
-    </w:p>
-    <w:p>
-      <w:pPr>
-        <w:pStyle w:val="ListParagraph"/>
-        <w:numPr>
-          <w:ilvl w:val="0"/>
-          <w:numId w:val="3"/>
-        </w:numPr>
-      </w:pPr>
-      <w:r>
-        <w:rPr>
-          <w:b/>
-          <w:bCs/>
-        </w:rPr>
-        <w:t>Host.SetFrameIndex(index)</w:t>
-      </w:r>
-      <w:r>
-        <w:t xml:space="preserve"> – Sets the system variable frame index to a specific value. Useful when the frame index is used as a random number seed or is used in other ways, to be able to set a specific point in time, or just reset back to 0 to restart.</w:t>
-      </w:r>
-    </w:p>
-    <w:p>
-      <w:pPr>
-        <w:pStyle w:val="ListParagraph"/>
-        <w:numPr>
-          <w:ilvl w:val="0"/>
-          <w:numId w:val="3"/>
-        </w:numPr>
-      </w:pPr>
-      <w:r>
-        <w:rPr>
-          <w:b/>
-          <w:bCs/>
-        </w:rPr>
-        <w:t>Host.WaitOnGPU()</w:t>
-      </w:r>
-      <w:r>
-        <w:t xml:space="preserve"> – Waits for all pending GPU work to be finished. It’s best practice to do this before a readback, to make sure you are getting the data you think you are.</w:t>
-      </w:r>
-    </w:p>
-    <w:p>
-      <w:pPr>
-        <w:pStyle w:val="ListParagraph"/>
-        <w:numPr>
-          <w:ilvl w:val="0"/>
-          <w:numId w:val="3"/>
-        </w:numPr>
-      </w:pPr>
-      <w:r>
-        <w:rPr>
-          <w:b/>
-          <w:bCs/>
-        </w:rPr>
-        <w:t>Host.Pause(pause)</w:t>
-      </w:r>
-      <w:r>
-        <w:t xml:space="preserve"> – Pause or unpause execution of the technique in the viewer. Does not effect Host.RunTechnique.</w:t>
-      </w:r>
-    </w:p>
-    <w:p>
-      <w:pPr>
-        <w:pStyle w:val="ListParagraph"/>
-        <w:numPr>
-          <w:ilvl w:val="0"/>
-          <w:numId w:val="3"/>
-        </w:numPr>
-      </w:pPr>
-      <w:r>
-        <w:rPr>
-          <w:b/>
-          <w:bCs/>
-        </w:rPr>
-        <w:t>Host.PixCaptureNextFrames(filename, frames = 1)</w:t>
-      </w:r>
-      <w:r>
-        <w:t xml:space="preserve"> – Causes a pix capture to be taken. If it wants N frames to be captured, you must run the technique that many times, or return control to the user to allow that many frames to be rendered.</w:t>
+        <w:rPr>
+          <w:lang w:val="en-US"/>
+        </w:rPr>
+        <w:t xml:space="preserve">- </w:t>
+      </w:r>
+      <w:r>
+        <w:rPr>
+          <w:lang w:val="en-US"/>
+        </w:rPr>
+        <w:t>Returns the number of collected shader asserts. Assert getters works with this collection.</w:t>
       </w:r>
     </w:p>
     <w:p>
@@ -1785,18 +2911,333 @@
         <w:rPr>
           <w:b/>
           <w:bCs/>
-        </w:rPr>
-        <w:t>GetImportedBufferBounds</w:t>
-      </w:r>
-      <w:r>
-        <w:rPr>
-          <w:b/>
-          <w:bCs/>
-        </w:rPr>
-        <w:t>(importedBufferName)</w:t>
-      </w:r>
-      <w:r>
-        <w:t xml:space="preserve"> – If this buffer has a field which has a position semantic, this will return the min and max bounding box of the buffer positions.</w:t>
+          <w:lang w:val="en-US"/>
+        </w:rPr>
+        <w:t>GetShaderAssertFormatStrId(index)</w:t>
+      </w:r>
+      <w:r>
+        <w:rPr>
+          <w:lang w:val="en-US"/>
+        </w:rPr>
+        <w:t xml:space="preserve"> - </w:t>
+      </w:r>
+      <w:r>
+        <w:rPr>
+          <w:lang w:val="en-US"/>
+        </w:rPr>
+        <w:t>Returns the ID of format string of the specified shader assert.</w:t>
+      </w:r>
+    </w:p>
+    <w:p>
+      <w:pPr>
+        <w:pStyle w:val="ListParagraph"/>
+        <w:numPr>
+          <w:ilvl w:val="0"/>
+          <w:numId w:val="3"/>
+        </w:numPr>
+      </w:pPr>
+      <w:r>
+        <w:rPr>
+          <w:b/>
+          <w:bCs/>
+          <w:lang w:val="en-US"/>
+        </w:rPr>
+        <w:t>Host.GetShaderAssertFormatString(index)</w:t>
+      </w:r>
+      <w:r>
+        <w:rPr>
+          <w:lang w:val="en-US"/>
+        </w:rPr>
+        <w:t xml:space="preserve"> - </w:t>
+      </w:r>
+      <w:r>
+        <w:rPr>
+          <w:lang w:val="en-US"/>
+        </w:rPr>
+        <w:t>Returns the format string of the specified shader assert.</w:t>
+      </w:r>
+    </w:p>
+    <w:p>
+      <w:pPr>
+        <w:pStyle w:val="ListParagraph"/>
+        <w:numPr>
+          <w:ilvl w:val="0"/>
+          <w:numId w:val="3"/>
+        </w:numPr>
+      </w:pPr>
+      <w:r>
+        <w:rPr>
+          <w:b/>
+          <w:bCs/>
+          <w:lang w:val="en-US"/>
+        </w:rPr>
+        <w:t>Host.GetShaderAssertDisplayName(index)</w:t>
+      </w:r>
+      <w:r>
+        <w:rPr>
+          <w:lang w:val="en-US"/>
+        </w:rPr>
+        <w:t xml:space="preserve"> - </w:t>
+      </w:r>
+      <w:r>
+        <w:rPr>
+          <w:lang w:val="en-US"/>
+        </w:rPr>
+        <w:t>Returns the display name of the specified shader assert.</w:t>
+      </w:r>
+    </w:p>
+    <w:p>
+      <w:pPr>
+        <w:pStyle w:val="ListParagraph"/>
+        <w:numPr>
+          <w:ilvl w:val="0"/>
+          <w:numId w:val="3"/>
+        </w:numPr>
+      </w:pPr>
+      <w:r>
+        <w:rPr>
+          <w:b/>
+          <w:bCs/>
+        </w:rPr>
+        <w:t>Host.</w:t>
+      </w:r>
+      <w:r>
+        <w:rPr>
+          <w:b/>
+          <w:bCs/>
+          <w:lang w:val="en-US"/>
+        </w:rPr>
+        <w:t>GetShaderAssertMsg(index)</w:t>
+      </w:r>
+      <w:r>
+        <w:rPr>
+          <w:lang w:val="en-US"/>
+        </w:rPr>
+        <w:t xml:space="preserve"> - </w:t>
+      </w:r>
+      <w:r>
+        <w:rPr>
+          <w:lang w:val="en-US"/>
+        </w:rPr>
+        <w:t>Returns the message of the specified assert.</w:t>
+      </w:r>
+    </w:p>
+    <w:p>
+      <w:pPr>
+        <w:pStyle w:val="ListParagraph"/>
+        <w:numPr>
+          <w:ilvl w:val="0"/>
+          <w:numId w:val="3"/>
+        </w:numPr>
+      </w:pPr>
+      <w:r>
+        <w:rPr>
+          <w:b/>
+          <w:bCs/>
+        </w:rPr>
+        <w:t>Host.AMDFrameGen_Enabled(value)</w:t>
+      </w:r>
+      <w:r>
+        <w:t xml:space="preserve"> – value is optional. If given, sets the setting to this value. Returns the value of the setting when this function was called.</w:t>
+      </w:r>
+    </w:p>
+    <w:p>
+      <w:pPr>
+        <w:pStyle w:val="ListParagraph"/>
+        <w:numPr>
+          <w:ilvl w:val="0"/>
+          <w:numId w:val="3"/>
+        </w:numPr>
+      </w:pPr>
+      <w:r>
+        <w:rPr>
+          <w:b/>
+          <w:bCs/>
+        </w:rPr>
+        <w:t>Host.AMDFrameGen_SleepMS(value)</w:t>
+      </w:r>
+      <w:r>
+        <w:t xml:space="preserve"> – value is optional. If given, sets the setting to this value. Returns the value of the setting when this function was called.</w:t>
+      </w:r>
+    </w:p>
+    <w:p>
+      <w:pPr>
+        <w:pStyle w:val="ListParagraph"/>
+        <w:numPr>
+          <w:ilvl w:val="0"/>
+          <w:numId w:val="3"/>
+        </w:numPr>
+      </w:pPr>
+      <w:r>
+        <w:rPr>
+          <w:b/>
+          <w:bCs/>
+        </w:rPr>
+        <w:t>Host.AMDFrameGen_</w:t>
+      </w:r>
+      <w:r>
+        <w:rPr>
+          <w:b/>
+          <w:bCs/>
+        </w:rPr>
+        <w:t>Depth</w:t>
+      </w:r>
+      <w:r>
+        <w:rPr>
+          <w:b/>
+          <w:bCs/>
+        </w:rPr>
+        <w:t>(value)</w:t>
+      </w:r>
+      <w:r>
+        <w:t xml:space="preserve"> – value is optional. If given, sets the setting to this value. Returns the value of the setting when this function was called.</w:t>
+      </w:r>
+    </w:p>
+    <w:p>
+      <w:pPr>
+        <w:pStyle w:val="ListParagraph"/>
+        <w:numPr>
+          <w:ilvl w:val="0"/>
+          <w:numId w:val="3"/>
+        </w:numPr>
+      </w:pPr>
+      <w:r>
+        <w:rPr>
+          <w:b/>
+          <w:bCs/>
+        </w:rPr>
+        <w:t>Host.AMDFrameGen_</w:t>
+      </w:r>
+      <w:r>
+        <w:rPr>
+          <w:b/>
+          <w:bCs/>
+        </w:rPr>
+        <w:t>MotionVectors</w:t>
+      </w:r>
+      <w:r>
+        <w:rPr>
+          <w:b/>
+          <w:bCs/>
+        </w:rPr>
+        <w:t>(value)</w:t>
+      </w:r>
+      <w:r>
+        <w:t xml:space="preserve"> – value is optional. If given, sets the setting to this value. Returns the value of the setting when this function was called.</w:t>
+      </w:r>
+    </w:p>
+    <w:p>
+      <w:pPr>
+        <w:pStyle w:val="ListParagraph"/>
+        <w:numPr>
+          <w:ilvl w:val="0"/>
+          <w:numId w:val="3"/>
+        </w:numPr>
+      </w:pPr>
+      <w:r>
+        <w:rPr>
+          <w:b/>
+          <w:bCs/>
+        </w:rPr>
+        <w:t>Host.AMDFrameGen_ENABLE_ASYNC_WORKLOAD_SUPPORT(value)</w:t>
+      </w:r>
+      <w:r>
+        <w:t xml:space="preserve"> – value is optional. If given, sets the setting to this value. Returns the value of the setting when this function was called.</w:t>
+      </w:r>
+    </w:p>
+    <w:p>
+      <w:pPr>
+        <w:pStyle w:val="ListParagraph"/>
+        <w:numPr>
+          <w:ilvl w:val="0"/>
+          <w:numId w:val="3"/>
+        </w:numPr>
+      </w:pPr>
+      <w:r>
+        <w:rPr>
+          <w:b/>
+          <w:bCs/>
+        </w:rPr>
+        <w:t>Host.AMDFrameGen_ENABLE_MOTION_VECTORS_JITTER_CANCELLATION(value)</w:t>
+      </w:r>
+      <w:r>
+        <w:t xml:space="preserve"> – value is optional. If given, sets the setting to this value. Returns the value of the setting when this function was called.</w:t>
+      </w:r>
+    </w:p>
+    <w:p>
+      <w:pPr>
+        <w:pStyle w:val="ListParagraph"/>
+        <w:numPr>
+          <w:ilvl w:val="0"/>
+          <w:numId w:val="3"/>
+        </w:numPr>
+      </w:pPr>
+      <w:r>
+        <w:rPr>
+          <w:b/>
+          <w:bCs/>
+        </w:rPr>
+        <w:t>Host.AMDFrameGen_ENABLE_HIGH_DYNAMIC_RANGE(value)</w:t>
+      </w:r>
+      <w:r>
+        <w:t xml:space="preserve"> – value is optional. If given, sets the setting to this value. Returns the value of the setting when this function was called.</w:t>
+      </w:r>
+    </w:p>
+    <w:p>
+      <w:pPr>
+        <w:pStyle w:val="ListParagraph"/>
+        <w:numPr>
+          <w:ilvl w:val="0"/>
+          <w:numId w:val="3"/>
+        </w:numPr>
+      </w:pPr>
+      <w:r>
+        <w:rPr>
+          <w:b/>
+          <w:bCs/>
+        </w:rPr>
+        <w:t>Host.AMDFrameGen_ENABLE_DEBUG_CHECKING(value)</w:t>
+      </w:r>
+      <w:r>
+        <w:t xml:space="preserve"> – value is optional. If given, sets the setting to this value. Returns the value of the setting when this function was called.</w:t>
+      </w:r>
+    </w:p>
+    <w:p>
+      <w:pPr>
+        <w:pStyle w:val="ListParagraph"/>
+        <w:numPr>
+          <w:ilvl w:val="0"/>
+          <w:numId w:val="3"/>
+        </w:numPr>
+      </w:pPr>
+      <w:r>
+        <w:rPr>
+          <w:b/>
+          <w:bCs/>
+        </w:rPr>
+        <w:t>Host.AMDFrameGen_DRAW_DEBUG_TEAR_LINES(value)</w:t>
+      </w:r>
+      <w:r>
+        <w:t xml:space="preserve"> – value is optional. If given, sets the setting to this value. Returns the value of the setting when this function was called.</w:t>
+      </w:r>
+    </w:p>
+    <w:p>
+      <w:pPr>
+        <w:pStyle w:val="ListParagraph"/>
+        <w:numPr>
+          <w:ilvl w:val="0"/>
+          <w:numId w:val="3"/>
+        </w:numPr>
+      </w:pPr>
+      <w:r>
+        <w:rPr>
+          <w:b/>
+          <w:bCs/>
+        </w:rPr>
+        <w:t>Host.AMDFrameGen_DRAW_DEBUG_RESET_INDICATORS(value)</w:t>
+      </w:r>
+      <w:r>
+        <w:t xml:space="preserve"> – value is optional. If given, sets the setting to this value. Returns the value of the setting when this function was called.</w:t>
       </w:r>
     </w:p>
     <w:p>
@@ -1813,1173 +3254,7 @@
           <w:bCs/>
         </w:rPr>
         <w:lastRenderedPageBreak/>
-        <w:t>Host.SetImported</w:t>
-      </w:r>
-      <w:r>
-        <w:rPr>
-          <w:b/>
-          <w:bCs/>
-        </w:rPr>
-        <w:t>Buffer</w:t>
-      </w:r>
-      <w:r>
-        <w:rPr>
-          <w:b/>
-          <w:bCs/>
-        </w:rPr>
-        <w:t>File(imported</w:t>
-      </w:r>
-      <w:r>
-        <w:rPr>
-          <w:b/>
-          <w:bCs/>
-        </w:rPr>
-        <w:t>Buffer</w:t>
-      </w:r>
-      <w:r>
-        <w:rPr>
-          <w:b/>
-          <w:bCs/>
-        </w:rPr>
-        <w:t>Name, fileName)</w:t>
-      </w:r>
-      <w:r>
-        <w:t xml:space="preserve"> – Sets the filename of an imported buffer.</w:t>
-      </w:r>
-    </w:p>
-    <w:p>
-      <w:pPr>
-        <w:pStyle w:val="ListParagraph"/>
-        <w:numPr>
-          <w:ilvl w:val="0"/>
-          <w:numId w:val="3"/>
-        </w:numPr>
-      </w:pPr>
-      <w:r>
-        <w:rPr>
-          <w:b/>
-          <w:bCs/>
-        </w:rPr>
-        <w:t>Host.SetImported</w:t>
-      </w:r>
-      <w:r>
-        <w:rPr>
-          <w:b/>
-          <w:bCs/>
-        </w:rPr>
-        <w:t>BufferStruct</w:t>
-      </w:r>
-      <w:r>
-        <w:rPr>
-          <w:b/>
-          <w:bCs/>
-        </w:rPr>
-        <w:t>(imported</w:t>
-      </w:r>
-      <w:r>
-        <w:rPr>
-          <w:b/>
-          <w:bCs/>
-        </w:rPr>
-        <w:t>Buffer</w:t>
-      </w:r>
-      <w:r>
-        <w:rPr>
-          <w:b/>
-          <w:bCs/>
-        </w:rPr>
-        <w:t xml:space="preserve">Name, </w:t>
-      </w:r>
-      <w:r>
-        <w:rPr>
-          <w:b/>
-          <w:bCs/>
-        </w:rPr>
-        <w:t>structName</w:t>
-      </w:r>
-      <w:r>
-        <w:rPr>
-          <w:b/>
-          <w:bCs/>
-        </w:rPr>
-        <w:t>)</w:t>
-      </w:r>
-      <w:r>
-        <w:t xml:space="preserve"> – Sets the buffer’s type to be a specific struct type.</w:t>
-      </w:r>
-    </w:p>
-    <w:p>
-      <w:pPr>
-        <w:pStyle w:val="ListParagraph"/>
-        <w:numPr>
-          <w:ilvl w:val="0"/>
-          <w:numId w:val="3"/>
-        </w:numPr>
-      </w:pPr>
-      <w:r>
-        <w:rPr>
-          <w:b/>
-          <w:bCs/>
-        </w:rPr>
-        <w:t>Host.SetImported</w:t>
-      </w:r>
-      <w:r>
-        <w:rPr>
-          <w:b/>
-          <w:bCs/>
-        </w:rPr>
-        <w:t>BufferCount</w:t>
-      </w:r>
-      <w:r>
-        <w:rPr>
-          <w:b/>
-          <w:bCs/>
-        </w:rPr>
-        <w:t>(imported</w:t>
-      </w:r>
-      <w:r>
-        <w:rPr>
-          <w:b/>
-          <w:bCs/>
-        </w:rPr>
-        <w:t>Buffer</w:t>
-      </w:r>
-      <w:r>
-        <w:rPr>
-          <w:b/>
-          <w:bCs/>
-        </w:rPr>
-        <w:t xml:space="preserve">Name, </w:t>
-      </w:r>
-      <w:r>
-        <w:rPr>
-          <w:b/>
-          <w:bCs/>
-        </w:rPr>
-        <w:t>type</w:t>
-      </w:r>
-      <w:r>
-        <w:rPr>
-          <w:b/>
-          <w:bCs/>
-        </w:rPr>
-        <w:t>)</w:t>
-      </w:r>
-      <w:r>
-        <w:t xml:space="preserve"> – Sets the buffer’s type to be a POD (non struct) type. Uses Host.</w:t>
-      </w:r>
-      <w:r>
-        <w:t>DataFieldType</w:t>
-      </w:r>
-      <w:r>
-        <w:t xml:space="preserve"> enum.  See PythonTypes.txt for more info.</w:t>
-      </w:r>
-    </w:p>
-    <w:p>
-      <w:pPr>
-        <w:pStyle w:val="ListParagraph"/>
-        <w:numPr>
-          <w:ilvl w:val="0"/>
-          <w:numId w:val="3"/>
-        </w:numPr>
-      </w:pPr>
-      <w:r>
-        <w:rPr>
-          <w:b/>
-          <w:bCs/>
-        </w:rPr>
-        <w:t>Host.SetImported</w:t>
-      </w:r>
-      <w:r>
-        <w:rPr>
-          <w:b/>
-          <w:bCs/>
-        </w:rPr>
-        <w:t>Buffer</w:t>
-      </w:r>
-      <w:r>
-        <w:rPr>
-          <w:b/>
-          <w:bCs/>
-        </w:rPr>
-        <w:t xml:space="preserve">CSVHeaderRow </w:t>
-      </w:r>
-      <w:r>
-        <w:rPr>
-          <w:b/>
-          <w:bCs/>
-        </w:rPr>
-        <w:t>(imported</w:t>
-      </w:r>
-      <w:r>
-        <w:rPr>
-          <w:b/>
-          <w:bCs/>
-        </w:rPr>
-        <w:t>Buffer</w:t>
-      </w:r>
-      <w:r>
-        <w:rPr>
-          <w:b/>
-          <w:bCs/>
-        </w:rPr>
-        <w:t xml:space="preserve">Name, </w:t>
-      </w:r>
-      <w:r>
-        <w:rPr>
-          <w:b/>
-          <w:bCs/>
-        </w:rPr>
-        <w:t>CSVHeaderRow</w:t>
-      </w:r>
-      <w:r>
-        <w:rPr>
-          <w:b/>
-          <w:bCs/>
-        </w:rPr>
-        <w:t>)</w:t>
-      </w:r>
-      <w:r>
-        <w:t xml:space="preserve"> – Sets whether or not the buffer’s csv file has a header row.</w:t>
-      </w:r>
-    </w:p>
-    <w:p>
-      <w:pPr>
-        <w:pStyle w:val="ListParagraph"/>
-        <w:numPr>
-          <w:ilvl w:val="0"/>
-          <w:numId w:val="3"/>
-        </w:numPr>
-      </w:pPr>
-      <w:r>
-        <w:rPr>
-          <w:b/>
-          <w:bCs/>
-        </w:rPr>
-        <w:t>Host.SetImported</w:t>
-      </w:r>
-      <w:r>
-        <w:rPr>
-          <w:b/>
-          <w:bCs/>
-        </w:rPr>
-        <w:t>BufferCount</w:t>
-      </w:r>
-      <w:r>
-        <w:rPr>
-          <w:b/>
-          <w:bCs/>
-        </w:rPr>
-        <w:t>(imported</w:t>
-      </w:r>
-      <w:r>
-        <w:rPr>
-          <w:b/>
-          <w:bCs/>
-        </w:rPr>
-        <w:t>Buffer</w:t>
-      </w:r>
-      <w:r>
-        <w:rPr>
-          <w:b/>
-          <w:bCs/>
-        </w:rPr>
-        <w:t xml:space="preserve">Name, </w:t>
-      </w:r>
-      <w:r>
-        <w:rPr>
-          <w:b/>
-          <w:bCs/>
-        </w:rPr>
-        <w:t>count</w:t>
-      </w:r>
-      <w:r>
-        <w:rPr>
-          <w:b/>
-          <w:bCs/>
-        </w:rPr>
-        <w:t>)</w:t>
-      </w:r>
-      <w:r>
-        <w:t xml:space="preserve"> – Sets how many items are in the buffer.</w:t>
-      </w:r>
-    </w:p>
-    <w:p>
-      <w:pPr>
-        <w:pStyle w:val="ListParagraph"/>
-        <w:numPr>
-          <w:ilvl w:val="0"/>
-          <w:numId w:val="3"/>
-        </w:numPr>
-      </w:pPr>
-      <w:r>
-        <w:rPr>
-          <w:b/>
-          <w:bCs/>
-        </w:rPr>
-        <w:t>Host.</w:t>
-      </w:r>
-      <w:r>
-        <w:rPr>
-          <w:b/>
-          <w:bCs/>
-          <w:lang w:val="en-US"/>
-        </w:rPr>
-        <w:t>SetImportedBufferMaterialShaderFile(</w:t>
-      </w:r>
-      <w:r>
-        <w:rPr>
-          <w:b/>
-          <w:bCs/>
-        </w:rPr>
-        <w:t>importedBufferName, fileName</w:t>
-      </w:r>
-      <w:r>
-        <w:rPr>
-          <w:b/>
-          <w:bCs/>
-          <w:lang w:val="en-US"/>
-        </w:rPr>
-        <w:t>)</w:t>
-      </w:r>
-      <w:r>
-        <w:rPr>
-          <w:lang w:val="en-US"/>
-        </w:rPr>
-        <w:t xml:space="preserve"> – If an imported buffer has a data stream of “Material”, this specifies the file to write for the generated material shader function.</w:t>
-      </w:r>
-    </w:p>
-    <w:p>
-      <w:pPr>
-        <w:pStyle w:val="ListParagraph"/>
-        <w:numPr>
-          <w:ilvl w:val="0"/>
-          <w:numId w:val="3"/>
-        </w:numPr>
-      </w:pPr>
-      <w:r>
-        <w:rPr>
-          <w:b/>
-          <w:bCs/>
-        </w:rPr>
-        <w:t>Host.SetImportedTextureFile(importedTextureName, fileName)</w:t>
-      </w:r>
-      <w:r>
-        <w:t xml:space="preserve"> – Sets the filename of an imported texture.</w:t>
-      </w:r>
-    </w:p>
-    <w:p>
-      <w:pPr>
-        <w:pStyle w:val="ListParagraph"/>
-        <w:numPr>
-          <w:ilvl w:val="0"/>
-          <w:numId w:val="3"/>
-        </w:numPr>
-      </w:pPr>
-      <w:r>
-        <w:rPr>
-          <w:b/>
-          <w:bCs/>
-        </w:rPr>
-        <w:t>Host.SetImportedTextureSourceIsSRGB(importedTextureName, sourceisSRGB)</w:t>
-      </w:r>
-      <w:r>
-        <w:t xml:space="preserve"> – Sets whether or not the source texture is SRGB.</w:t>
-      </w:r>
-    </w:p>
-    <w:p>
-      <w:pPr>
-        <w:pStyle w:val="ListParagraph"/>
-        <w:numPr>
-          <w:ilvl w:val="0"/>
-          <w:numId w:val="3"/>
-        </w:numPr>
-      </w:pPr>
-      <w:r>
-        <w:rPr>
-          <w:b/>
-          <w:bCs/>
-        </w:rPr>
-        <w:t>Host.SetImportedTextureMakeMips(importedTextureName, makeMips)</w:t>
-      </w:r>
-      <w:r>
-        <w:t xml:space="preserve"> – Sets whether or not to make mips for the imported texture.</w:t>
-      </w:r>
-    </w:p>
-    <w:p>
-      <w:pPr>
-        <w:pStyle w:val="ListParagraph"/>
-        <w:numPr>
-          <w:ilvl w:val="0"/>
-          <w:numId w:val="3"/>
-        </w:numPr>
-      </w:pPr>
-      <w:r>
-        <w:rPr>
-          <w:b/>
-          <w:bCs/>
-        </w:rPr>
-        <w:t>Host.</w:t>
-      </w:r>
-      <w:r>
-        <w:rPr>
-          <w:b/>
-          <w:bCs/>
-        </w:rPr>
-        <w:t>SetImportedTextureFormat(importedTextureName, format)</w:t>
-      </w:r>
-      <w:r>
-        <w:t xml:space="preserve"> – Sets the format of an imported texture. The importedTextureName is the name of the texture in the “Imported Resources” window. The format is specified using the enum Host.TextureFormat.  Append the format you see in the drop down to Host.TextureFormat, such as </w:t>
-      </w:r>
-      <w:r>
-        <w:t>Host.TextureFormat_RGBA32_Float</w:t>
-      </w:r>
-      <w:r>
-        <w:t>.</w:t>
-      </w:r>
-    </w:p>
-    <w:p>
-      <w:pPr>
-        <w:pStyle w:val="ListParagraph"/>
-        <w:numPr>
-          <w:ilvl w:val="0"/>
-          <w:numId w:val="3"/>
-        </w:numPr>
-      </w:pPr>
-      <w:r>
-        <w:rPr>
-          <w:b/>
-          <w:bCs/>
-        </w:rPr>
-        <w:t>Host.SetImportedTextureColor(importedTextureName, R, G, B, A)</w:t>
-      </w:r>
-      <w:r>
-        <w:t xml:space="preserve"> – Sets the color of an imported texture.</w:t>
-      </w:r>
-    </w:p>
-    <w:p>
-      <w:pPr>
-        <w:pStyle w:val="ListParagraph"/>
-        <w:numPr>
-          <w:ilvl w:val="0"/>
-          <w:numId w:val="3"/>
-        </w:numPr>
-      </w:pPr>
-      <w:r>
-        <w:rPr>
-          <w:b/>
-          <w:bCs/>
-        </w:rPr>
-        <w:t>Host.SetImportedTextureSize(importedTextureName, x, y, z)</w:t>
-      </w:r>
-      <w:r>
-        <w:t xml:space="preserve"> – Set the size of an imported texture. The importedTextureName is the name of the texture in the “Imported Resources” window. x,y,z should be integers.</w:t>
-      </w:r>
-      <w:r>
-        <w:t xml:space="preserve">  For a 2D texture, set z to 1, not 0.</w:t>
-      </w:r>
-    </w:p>
-    <w:p>
-      <w:pPr>
-        <w:pStyle w:val="ListParagraph"/>
-        <w:numPr>
-          <w:ilvl w:val="0"/>
-          <w:numId w:val="3"/>
-        </w:numPr>
-      </w:pPr>
-      <w:r>
-        <w:rPr>
-          <w:b/>
-          <w:bCs/>
-        </w:rPr>
-        <w:t>Host.SetImportedTexture</w:t>
-      </w:r>
-      <w:r>
-        <w:rPr>
-          <w:b/>
-          <w:bCs/>
-        </w:rPr>
-        <w:t>Binary</w:t>
-      </w:r>
-      <w:r>
-        <w:rPr>
-          <w:b/>
-          <w:bCs/>
-        </w:rPr>
-        <w:t>Size(importedTextureName, x, y, z)</w:t>
-      </w:r>
-      <w:r>
-        <w:t xml:space="preserve"> – Set the size of an imported texture if it’s a binary file. The importedTextureName is the name of the texture in the “Imported Resources” window. x,y,z should be integers.  For a 2D texture, set z to 1, not 0.</w:t>
-      </w:r>
-    </w:p>
-    <w:p>
-      <w:pPr>
-        <w:pStyle w:val="ListParagraph"/>
-        <w:numPr>
-          <w:ilvl w:val="0"/>
-          <w:numId w:val="3"/>
-        </w:numPr>
-      </w:pPr>
-      <w:r>
-        <w:rPr>
-          <w:b/>
-          <w:bCs/>
-        </w:rPr>
-        <w:t>Host.SetImportedTexture</w:t>
-      </w:r>
-      <w:r>
-        <w:rPr>
-          <w:b/>
-          <w:bCs/>
-        </w:rPr>
-        <w:t>Binary</w:t>
-      </w:r>
-      <w:r>
-        <w:rPr>
-          <w:b/>
-          <w:bCs/>
-        </w:rPr>
-        <w:t>Format(importedTextureName, format)</w:t>
-      </w:r>
-      <w:r>
-        <w:t xml:space="preserve"> – Sets the format of the binary file being loaded for the imported texture.</w:t>
-      </w:r>
-    </w:p>
-    <w:p>
-      <w:pPr>
-        <w:pStyle w:val="ListParagraph"/>
-        <w:numPr>
-          <w:ilvl w:val="0"/>
-          <w:numId w:val="3"/>
-        </w:numPr>
-      </w:pPr>
-      <w:r>
-        <w:rPr>
-          <w:b/>
-          <w:bCs/>
-        </w:rPr>
-        <w:t>Host.SetFrameDeltaTime(</w:t>
-      </w:r>
-      <w:r>
-        <w:rPr>
-          <w:b/>
-          <w:bCs/>
-        </w:rPr>
-        <w:t>deltaTime</w:t>
-      </w:r>
-      <w:r>
-        <w:rPr>
-          <w:b/>
-          <w:bCs/>
-        </w:rPr>
-        <w:t>)</w:t>
-      </w:r>
-      <w:r>
-        <w:t xml:space="preserve"> – in seconds. This sets the system variable for the frame delta time to a fixed value. Useful if wanting to record a video. Set to &lt;= 0 to clear the forced delta time.</w:t>
-      </w:r>
-    </w:p>
-    <w:p>
-      <w:pPr>
-        <w:pStyle w:val="ListParagraph"/>
-        <w:numPr>
-          <w:ilvl w:val="0"/>
-          <w:numId w:val="3"/>
-        </w:numPr>
-      </w:pPr>
-      <w:r>
-        <w:rPr>
-          <w:b/>
-          <w:bCs/>
-        </w:rPr>
-        <w:t>Host.</w:t>
-      </w:r>
-      <w:r>
-        <w:rPr>
-          <w:b/>
-          <w:bCs/>
-        </w:rPr>
-        <w:t>SetCameraPos(x,y,z)</w:t>
-      </w:r>
-      <w:r>
-        <w:t xml:space="preserve"> – set the position of the camera.</w:t>
-      </w:r>
-    </w:p>
-    <w:p>
-      <w:pPr>
-        <w:pStyle w:val="ListParagraph"/>
-        <w:numPr>
-          <w:ilvl w:val="0"/>
-          <w:numId w:val="3"/>
-        </w:numPr>
-      </w:pPr>
-      <w:r>
-        <w:rPr>
-          <w:b/>
-          <w:bCs/>
-        </w:rPr>
-        <w:t>Host.SetCameraFOV(fov)</w:t>
-      </w:r>
-      <w:r>
-        <w:t xml:space="preserve"> – sets the FOV of the camera.</w:t>
-      </w:r>
-    </w:p>
-    <w:p>
-      <w:pPr>
-        <w:pStyle w:val="ListParagraph"/>
-        <w:numPr>
-          <w:ilvl w:val="0"/>
-          <w:numId w:val="3"/>
-        </w:numPr>
-      </w:pPr>
-      <w:r>
-        <w:rPr>
-          <w:b/>
-          <w:bCs/>
-        </w:rPr>
-        <w:t>Host.SetCameraAltitudeAzimuth(altitude, azimuth)</w:t>
-      </w:r>
-      <w:r>
-        <w:t xml:space="preserve"> – in radians. We should add a “look at” function and similar to make working with the camera easier.</w:t>
-      </w:r>
-    </w:p>
-    <w:p>
-      <w:pPr>
-        <w:pStyle w:val="ListParagraph"/>
-        <w:numPr>
-          <w:ilvl w:val="0"/>
-          <w:numId w:val="3"/>
-        </w:numPr>
-      </w:pPr>
-      <w:r>
-        <w:rPr>
-          <w:b/>
-          <w:bCs/>
-        </w:rPr>
-        <w:t>Host.</w:t>
-      </w:r>
-      <w:r>
-        <w:rPr>
-          <w:b/>
-          <w:bCs/>
-          <w:lang w:val="en-US"/>
-        </w:rPr>
-        <w:t>SetCameraNearFarZ(nearZ, farZ)</w:t>
-      </w:r>
-      <w:r>
-        <w:rPr>
-          <w:lang w:val="en-US"/>
-        </w:rPr>
-        <w:t xml:space="preserve"> – sets the near and far plane of the camera</w:t>
-      </w:r>
-    </w:p>
-    <w:p>
-      <w:pPr>
-        <w:pStyle w:val="ListParagraph"/>
-        <w:numPr>
-          <w:ilvl w:val="0"/>
-          <w:numId w:val="3"/>
-        </w:numPr>
-      </w:pPr>
-      <w:r>
-        <w:rPr>
-          <w:b/>
-          <w:bCs/>
-        </w:rPr>
-        <w:t>Host.</w:t>
-      </w:r>
-      <w:r>
-        <w:rPr>
-          <w:b/>
-          <w:bCs/>
-          <w:lang w:val="en-US"/>
-        </w:rPr>
-        <w:t>SetCameraFlySpeed(speed)</w:t>
-      </w:r>
-      <w:r>
-        <w:rPr>
-          <w:lang w:val="en-US"/>
-        </w:rPr>
-        <w:t xml:space="preserve"> – sets the fly speed of the camera</w:t>
-      </w:r>
-    </w:p>
-    <w:p>
-      <w:pPr>
-        <w:pStyle w:val="ListParagraph"/>
-        <w:numPr>
-          <w:ilvl w:val="0"/>
-          <w:numId w:val="3"/>
-        </w:numPr>
-      </w:pPr>
-      <w:r>
-        <w:rPr>
-          <w:b/>
-          <w:bCs/>
-        </w:rPr>
-        <w:lastRenderedPageBreak/>
-        <w:t>Host.GetCameraPos()</w:t>
-      </w:r>
-      <w:r>
-        <w:t xml:space="preserve"> – returns the x,y,z position of the camera</w:t>
-      </w:r>
-    </w:p>
-    <w:p>
-      <w:pPr>
-        <w:pStyle w:val="ListParagraph"/>
-        <w:numPr>
-          <w:ilvl w:val="0"/>
-          <w:numId w:val="3"/>
-        </w:numPr>
-      </w:pPr>
-      <w:r>
-        <w:rPr>
-          <w:b/>
-          <w:bCs/>
-        </w:rPr>
-        <w:t>Host.GetCameraAltitudeAzimuth()</w:t>
-      </w:r>
-      <w:r>
-        <w:t xml:space="preserve"> – returns the altitude and azimuth of the camera. In radians.</w:t>
-      </w:r>
-    </w:p>
-    <w:p>
-      <w:pPr>
-        <w:pStyle w:val="ListParagraph"/>
-        <w:numPr>
-          <w:ilvl w:val="0"/>
-          <w:numId w:val="3"/>
-        </w:numPr>
-      </w:pPr>
-      <w:r>
-        <w:rPr>
-          <w:b/>
-          <w:bCs/>
-        </w:rPr>
-        <w:t>Host.</w:t>
-      </w:r>
-      <w:r>
-        <w:rPr>
-          <w:b/>
-          <w:bCs/>
-        </w:rPr>
-        <w:t>WriteGPUResource(name, value, subresourceIndex = 0)</w:t>
-      </w:r>
-      <w:r>
-        <w:t xml:space="preserve"> </w:t>
-      </w:r>
-      <w:r>
-        <w:t>–</w:t>
-      </w:r>
-      <w:r>
-        <w:t xml:space="preserve"> </w:t>
-      </w:r>
-      <w:r>
-        <w:t xml:space="preserve">This causes a gpu resource to be written the next time the technique is executed.  </w:t>
-      </w:r>
-      <w:r>
-        <w:t>The name is the name shown at the top of the resource viewer, such as “</w:t>
-      </w:r>
-      <w:r>
-        <w:t>Node_1.output: Output (UAV - After)</w:t>
-      </w:r>
-      <w:r>
-        <w:t>”. While those names are a mouth full, they uniquely identify the resource to write, as well as what part of the rendering timeline to write the value.  There is a “copy to clipboard” button next to the name for your convenience. The value is expected to be a bytes object that is the same size as the destination resource. The subresourceIndex is only used by texture2darrays, where it is the array index.</w:t>
-      </w:r>
-    </w:p>
-    <w:p>
-      <w:pPr>
-        <w:pStyle w:val="ListParagraph"/>
-        <w:numPr>
-          <w:ilvl w:val="0"/>
-          <w:numId w:val="3"/>
-        </w:numPr>
-      </w:pPr>
-      <w:r>
-        <w:rPr>
-          <w:b/>
-          <w:bCs/>
-        </w:rPr>
-        <w:t>Host.ForceEnableProfiling(set=True)</w:t>
-      </w:r>
-      <w:r>
-        <w:t xml:space="preserve"> – Let the viewer know about your intent to read profiling data. must be called before calling Host.</w:t>
-      </w:r>
-      <w:r>
-        <w:t>GetProfilingData</w:t>
-      </w:r>
-      <w:r>
-        <w:t>(). Profiling data is not available until the technique is executed.</w:t>
-      </w:r>
-    </w:p>
-    <w:p>
-      <w:pPr>
-        <w:pStyle w:val="ListParagraph"/>
-        <w:numPr>
-          <w:ilvl w:val="0"/>
-          <w:numId w:val="3"/>
-        </w:numPr>
-      </w:pPr>
-      <w:r>
-        <w:rPr>
-          <w:b/>
-          <w:bCs/>
-        </w:rPr>
-        <w:t>Host.GetProfilingData()</w:t>
-      </w:r>
-      <w:r>
-        <w:t xml:space="preserve"> – Returns a dictionary mapping render graph node names to an array which contains the cpu and gpu timing in milliseconds, respectively.  Also contains a “total”.</w:t>
-      </w:r>
-    </w:p>
-    <w:p>
-      <w:pPr>
-        <w:pStyle w:val="ListParagraph"/>
-        <w:numPr>
-          <w:ilvl w:val="0"/>
-          <w:numId w:val="3"/>
-        </w:numPr>
-      </w:pPr>
-      <w:r>
-        <w:rPr>
-          <w:b/>
-          <w:bCs/>
-        </w:rPr>
-        <w:t>Host.IsResourceCreated(nodeName)</w:t>
-      </w:r>
-      <w:r>
-        <w:t xml:space="preserve"> – Returns whether the resource node specified has its resource created or not. Takes a node name, not a resource name.</w:t>
-      </w:r>
-    </w:p>
-    <w:p>
-      <w:pPr>
-        <w:pStyle w:val="ListParagraph"/>
-        <w:numPr>
-          <w:ilvl w:val="0"/>
-          <w:numId w:val="3"/>
-        </w:numPr>
-      </w:pPr>
-      <w:r>
-        <w:rPr>
-          <w:b/>
-          <w:bCs/>
-        </w:rPr>
-        <w:t>Host.SetViewedResource(resourceName)</w:t>
-      </w:r>
-      <w:r>
-        <w:t xml:space="preserve"> – Makes the viewer view the specified resource name.  This is the same resource name you see in the viewer, such as “Input – Initial State”, not the node name.</w:t>
-      </w:r>
-    </w:p>
-    <w:p>
-      <w:pPr>
-        <w:pStyle w:val="ListParagraph"/>
-        <w:numPr>
-          <w:ilvl w:val="0"/>
-          <w:numId w:val="3"/>
-        </w:numPr>
-      </w:pPr>
-      <w:r>
-        <w:rPr>
-          <w:b/>
-          <w:bCs/>
-        </w:rPr>
-        <w:t>Host</w:t>
-      </w:r>
-      <w:r>
-        <w:rPr>
-          <w:b/>
-          <w:bCs/>
-        </w:rPr>
-        <w:t xml:space="preserve">.GGEnumValue(enumName, enumLabel) </w:t>
-      </w:r>
-      <w:r>
-        <w:t>– This returns the integer value of the enum label within the enum name given.</w:t>
-      </w:r>
-    </w:p>
-    <w:p>
-      <w:pPr>
-        <w:pStyle w:val="ListParagraph"/>
-        <w:numPr>
-          <w:ilvl w:val="0"/>
-          <w:numId w:val="3"/>
-        </w:numPr>
-      </w:pPr>
-      <w:r>
-        <w:rPr>
-          <w:b/>
-          <w:bCs/>
-        </w:rPr>
-        <w:t>Host.GGEnumLabel(enumName, value)</w:t>
-      </w:r>
-      <w:r>
-        <w:t xml:space="preserve"> – This returns the string label of the integer value in the enum.</w:t>
-      </w:r>
-    </w:p>
-    <w:p>
-      <w:pPr>
-        <w:pStyle w:val="ListParagraph"/>
-        <w:numPr>
-          <w:ilvl w:val="0"/>
-          <w:numId w:val="3"/>
-        </w:numPr>
-      </w:pPr>
-      <w:r>
-        <w:rPr>
-          <w:b/>
-          <w:bCs/>
-        </w:rPr>
-        <w:t>Host</w:t>
-      </w:r>
-      <w:r>
-        <w:rPr>
-          <w:b/>
-          <w:bCs/>
-        </w:rPr>
-        <w:t>.GGEnumCount(enumName)</w:t>
-      </w:r>
-      <w:r>
-        <w:t xml:space="preserve"> – Returns an integer count of how many items there are in the enum.</w:t>
-      </w:r>
-    </w:p>
-    <w:p>
-      <w:pPr>
-        <w:pStyle w:val="ListParagraph"/>
-        <w:numPr>
-          <w:ilvl w:val="0"/>
-          <w:numId w:val="3"/>
-        </w:numPr>
-      </w:pPr>
-      <w:r>
-        <w:rPr>
-          <w:b/>
-          <w:bCs/>
-        </w:rPr>
-        <w:t>Host.GetGPUString()</w:t>
-      </w:r>
-      <w:r>
-        <w:t xml:space="preserve"> – Returns a string with the GPU name and driver version.</w:t>
-      </w:r>
-    </w:p>
-    <w:p>
-      <w:pPr>
-        <w:pStyle w:val="ListParagraph"/>
-        <w:numPr>
-          <w:ilvl w:val="0"/>
-          <w:numId w:val="3"/>
-        </w:numPr>
-      </w:pPr>
-      <w:r>
-        <w:rPr>
-          <w:b/>
-          <w:bCs/>
-        </w:rPr>
-        <w:t>Host.SetShaderAssertsLogging(value)</w:t>
-      </w:r>
-      <w:r>
-        <w:t xml:space="preserve"> - </w:t>
-      </w:r>
-      <w:r>
-        <w:rPr>
-          <w:lang w:val="en-US"/>
-        </w:rPr>
-        <w:t>Toggles auto error logging of the collected shader asserts after a technique execution.</w:t>
-      </w:r>
-      <w:r>
-        <w:rPr>
-          <w:lang w:val="en-US"/>
-        </w:rPr>
-        <w:t xml:space="preserve"> Value is </w:t>
-      </w:r>
-      <w:r>
-        <w:rPr>
-          <w:lang w:val="en-US"/>
-        </w:rPr>
-        <w:t>Boolean.</w:t>
-      </w:r>
-    </w:p>
-    <w:p>
-      <w:pPr>
-        <w:pStyle w:val="ListParagraph"/>
-        <w:numPr>
-          <w:ilvl w:val="0"/>
-          <w:numId w:val="3"/>
-        </w:numPr>
-      </w:pPr>
-      <w:r>
-        <w:rPr>
-          <w:b/>
-          <w:bCs/>
-        </w:rPr>
-        <w:t>Host.</w:t>
-      </w:r>
-      <w:r>
-        <w:rPr>
-          <w:b/>
-          <w:bCs/>
-          <w:lang w:val="en-US"/>
-        </w:rPr>
-        <w:t>GetCollectedShaderAssertsCount()</w:t>
-      </w:r>
-      <w:r>
-        <w:rPr>
-          <w:lang w:val="en-US"/>
-        </w:rPr>
-        <w:t xml:space="preserve"> </w:t>
-      </w:r>
-      <w:r>
-        <w:rPr>
-          <w:lang w:val="en-US"/>
-        </w:rPr>
-        <w:t xml:space="preserve">- </w:t>
-      </w:r>
-      <w:r>
-        <w:rPr>
-          <w:lang w:val="en-US"/>
-        </w:rPr>
-        <w:t>Returns the number of collected shader asserts. Assert getters works with this collection.</w:t>
-      </w:r>
-    </w:p>
-    <w:p>
-      <w:pPr>
-        <w:pStyle w:val="ListParagraph"/>
-        <w:numPr>
-          <w:ilvl w:val="0"/>
-          <w:numId w:val="3"/>
-        </w:numPr>
-      </w:pPr>
-      <w:r>
-        <w:rPr>
-          <w:b/>
-          <w:bCs/>
-        </w:rPr>
-        <w:t>Host.</w:t>
-      </w:r>
-      <w:r>
-        <w:rPr>
-          <w:b/>
-          <w:bCs/>
-          <w:lang w:val="en-US"/>
-        </w:rPr>
-        <w:t>GetShaderAssertFormatStrId(index)</w:t>
-      </w:r>
-      <w:r>
-        <w:rPr>
-          <w:lang w:val="en-US"/>
-        </w:rPr>
-        <w:t xml:space="preserve"> - </w:t>
-      </w:r>
-      <w:r>
-        <w:rPr>
-          <w:lang w:val="en-US"/>
-        </w:rPr>
-        <w:t>Returns the ID of format string of the specified shader assert.</w:t>
-      </w:r>
-    </w:p>
-    <w:p>
-      <w:pPr>
-        <w:pStyle w:val="ListParagraph"/>
-        <w:numPr>
-          <w:ilvl w:val="0"/>
-          <w:numId w:val="3"/>
-        </w:numPr>
-      </w:pPr>
-      <w:r>
-        <w:rPr>
-          <w:b/>
-          <w:bCs/>
-          <w:lang w:val="en-US"/>
-        </w:rPr>
-        <w:t>Host.GetShaderAssertFormatString(index)</w:t>
-      </w:r>
-      <w:r>
-        <w:rPr>
-          <w:lang w:val="en-US"/>
-        </w:rPr>
-        <w:t xml:space="preserve"> - </w:t>
-      </w:r>
-      <w:r>
-        <w:rPr>
-          <w:lang w:val="en-US"/>
-        </w:rPr>
-        <w:t>Returns the format string of the specified shader assert.</w:t>
-      </w:r>
-    </w:p>
-    <w:p>
-      <w:pPr>
-        <w:pStyle w:val="ListParagraph"/>
-        <w:numPr>
-          <w:ilvl w:val="0"/>
-          <w:numId w:val="3"/>
-        </w:numPr>
-      </w:pPr>
-      <w:r>
-        <w:rPr>
-          <w:b/>
-          <w:bCs/>
-          <w:lang w:val="en-US"/>
-        </w:rPr>
-        <w:t>Host.GetShaderAssertDisplayName(index)</w:t>
-      </w:r>
-      <w:r>
-        <w:rPr>
-          <w:lang w:val="en-US"/>
-        </w:rPr>
-        <w:t xml:space="preserve"> - </w:t>
-      </w:r>
-      <w:r>
-        <w:rPr>
-          <w:lang w:val="en-US"/>
-        </w:rPr>
-        <w:t>Returns the display name of the specified shader assert.</w:t>
-      </w:r>
-    </w:p>
-    <w:p>
-      <w:pPr>
-        <w:pStyle w:val="ListParagraph"/>
-        <w:numPr>
-          <w:ilvl w:val="0"/>
-          <w:numId w:val="3"/>
-        </w:numPr>
-      </w:pPr>
-      <w:r>
-        <w:rPr>
-          <w:b/>
-          <w:bCs/>
-        </w:rPr>
-        <w:t>Host.</w:t>
-      </w:r>
-      <w:r>
-        <w:rPr>
-          <w:b/>
-          <w:bCs/>
-          <w:lang w:val="en-US"/>
-        </w:rPr>
-        <w:t>GetShaderAssertMsg(index)</w:t>
-      </w:r>
-      <w:r>
-        <w:rPr>
-          <w:lang w:val="en-US"/>
-        </w:rPr>
-        <w:t xml:space="preserve"> - </w:t>
-      </w:r>
-      <w:r>
-        <w:rPr>
-          <w:lang w:val="en-US"/>
-        </w:rPr>
-        <w:t>Returns the message of the specified assert.</w:t>
-      </w:r>
-    </w:p>
-    <w:p>
-      <w:pPr>
-        <w:pStyle w:val="ListParagraph"/>
-        <w:numPr>
-          <w:ilvl w:val="0"/>
-          <w:numId w:val="3"/>
-        </w:numPr>
-      </w:pPr>
-      <w:r>
-        <w:rPr>
-          <w:b/>
-          <w:bCs/>
-        </w:rPr>
-        <w:t>Host.AMDFrameGen_Enabled(value)</w:t>
+        <w:t>Host.AMDFrameGen_DRAW_DEBUG_VIEW(value)</w:t>
       </w:r>
       <w:r>
         <w:t xml:space="preserve"> – value is optional. If given, sets the setting to this value. Returns the value of the setting when this function was called.</w:t>
@@ -2998,7 +3273,7 @@
           <w:b/>
           <w:bCs/>
         </w:rPr>
-        <w:t>Host.AMDFrameGen_SleepMS(value)</w:t>
+        <w:t>Host.AMDFrameGen_DRAW_DEBUG_PACING_LINES(value)</w:t>
       </w:r>
       <w:r>
         <w:t xml:space="preserve"> – value is optional. If given, sets the setting to this value. Returns the value of the setting when this function was called.</w:t>
@@ -3017,21 +3292,7 @@
           <w:b/>
           <w:bCs/>
         </w:rPr>
-        <w:t>Host.AMDFrameGen_</w:t>
-      </w:r>
-      <w:r>
-        <w:rPr>
-          <w:b/>
-          <w:bCs/>
-        </w:rPr>
-        <w:t>Depth</w:t>
-      </w:r>
-      <w:r>
-        <w:rPr>
-          <w:b/>
-          <w:bCs/>
-        </w:rPr>
-        <w:t>(value)</w:t>
+        <w:t>Host.AMDFrameGen_allowAsyncWorkloads(value)</w:t>
       </w:r>
       <w:r>
         <w:t xml:space="preserve"> – value is optional. If given, sets the setting to this value. Returns the value of the setting when this function was called.</w:t>
@@ -3050,22 +3311,7 @@
           <w:b/>
           <w:bCs/>
         </w:rPr>
-        <w:lastRenderedPageBreak/>
-        <w:t>Host.AMDFrameGen_</w:t>
-      </w:r>
-      <w:r>
-        <w:rPr>
-          <w:b/>
-          <w:bCs/>
-        </w:rPr>
-        <w:t>MotionVectors</w:t>
-      </w:r>
-      <w:r>
-        <w:rPr>
-          <w:b/>
-          <w:bCs/>
-        </w:rPr>
-        <w:t>(value)</w:t>
+        <w:t>Host.AMDFrameGen_onlyPresentGenerated(value)</w:t>
       </w:r>
       <w:r>
         <w:t xml:space="preserve"> – value is optional. If given, sets the setting to this value. Returns the value of the setting when this function was called.</w:t>
@@ -3084,7 +3330,7 @@
           <w:b/>
           <w:bCs/>
         </w:rPr>
-        <w:t>Host.AMDFrameGen_ENABLE_ASYNC_WORKLOAD_SUPPORT(value)</w:t>
+        <w:t>Host.AMDFrameGen_constrainToRectangle(value)</w:t>
       </w:r>
       <w:r>
         <w:t xml:space="preserve"> – value is optional. If given, sets the setting to this value. Returns the value of the setting when this function was called.</w:t>
@@ -3103,196 +3349,6 @@
           <w:b/>
           <w:bCs/>
         </w:rPr>
-        <w:t>Host.AMDFrameGen_ENABLE_MOTION_VECTORS_JITTER_CANCELLATION(value)</w:t>
-      </w:r>
-      <w:r>
-        <w:t xml:space="preserve"> – value is optional. If given, sets the setting to this value. Returns the value of the setting when this function was called.</w:t>
-      </w:r>
-    </w:p>
-    <w:p>
-      <w:pPr>
-        <w:pStyle w:val="ListParagraph"/>
-        <w:numPr>
-          <w:ilvl w:val="0"/>
-          <w:numId w:val="3"/>
-        </w:numPr>
-      </w:pPr>
-      <w:r>
-        <w:rPr>
-          <w:b/>
-          <w:bCs/>
-        </w:rPr>
-        <w:t>Host.AMDFrameGen_ENABLE_HIGH_DYNAMIC_RANGE(value)</w:t>
-      </w:r>
-      <w:r>
-        <w:t xml:space="preserve"> – value is optional. If given, sets the setting to this value. Returns the value of the setting when this function was called.</w:t>
-      </w:r>
-    </w:p>
-    <w:p>
-      <w:pPr>
-        <w:pStyle w:val="ListParagraph"/>
-        <w:numPr>
-          <w:ilvl w:val="0"/>
-          <w:numId w:val="3"/>
-        </w:numPr>
-      </w:pPr>
-      <w:r>
-        <w:rPr>
-          <w:b/>
-          <w:bCs/>
-        </w:rPr>
-        <w:t>Host.AMDFrameGen_ENABLE_DEBUG_CHECKING(value)</w:t>
-      </w:r>
-      <w:r>
-        <w:t xml:space="preserve"> – value is optional. If given, sets the setting to this value. Returns the value of the setting when this function was called.</w:t>
-      </w:r>
-    </w:p>
-    <w:p>
-      <w:pPr>
-        <w:pStyle w:val="ListParagraph"/>
-        <w:numPr>
-          <w:ilvl w:val="0"/>
-          <w:numId w:val="3"/>
-        </w:numPr>
-      </w:pPr>
-      <w:r>
-        <w:rPr>
-          <w:b/>
-          <w:bCs/>
-        </w:rPr>
-        <w:t>Host.AMDFrameGen_DRAW_DEBUG_TEAR_LINES(value)</w:t>
-      </w:r>
-      <w:r>
-        <w:t xml:space="preserve"> – value is optional. If given, sets the setting to this value. Returns the value of the setting when this function was called.</w:t>
-      </w:r>
-    </w:p>
-    <w:p>
-      <w:pPr>
-        <w:pStyle w:val="ListParagraph"/>
-        <w:numPr>
-          <w:ilvl w:val="0"/>
-          <w:numId w:val="3"/>
-        </w:numPr>
-      </w:pPr>
-      <w:r>
-        <w:rPr>
-          <w:b/>
-          <w:bCs/>
-        </w:rPr>
-        <w:t>Host.AMDFrameGen_DRAW_DEBUG_RESET_INDICATORS(value)</w:t>
-      </w:r>
-      <w:r>
-        <w:t xml:space="preserve"> – value is optional. If given, sets the setting to this value. Returns the value of the setting when this function was called.</w:t>
-      </w:r>
-    </w:p>
-    <w:p>
-      <w:pPr>
-        <w:pStyle w:val="ListParagraph"/>
-        <w:numPr>
-          <w:ilvl w:val="0"/>
-          <w:numId w:val="3"/>
-        </w:numPr>
-      </w:pPr>
-      <w:r>
-        <w:rPr>
-          <w:b/>
-          <w:bCs/>
-        </w:rPr>
-        <w:t>Host.AMDFrameGen_DRAW_DEBUG_VIEW(value)</w:t>
-      </w:r>
-      <w:r>
-        <w:t xml:space="preserve"> – value is optional. If given, sets the setting to this value. Returns the value of the setting when this function was called.</w:t>
-      </w:r>
-    </w:p>
-    <w:p>
-      <w:pPr>
-        <w:pStyle w:val="ListParagraph"/>
-        <w:numPr>
-          <w:ilvl w:val="0"/>
-          <w:numId w:val="3"/>
-        </w:numPr>
-      </w:pPr>
-      <w:r>
-        <w:rPr>
-          <w:b/>
-          <w:bCs/>
-        </w:rPr>
-        <w:t>Host.AMDFrameGen_DRAW_DEBUG_PACING_LINES(value)</w:t>
-      </w:r>
-      <w:r>
-        <w:t xml:space="preserve"> – value is optional. If given, sets the setting to this value. Returns the value of the setting when this function was called.</w:t>
-      </w:r>
-    </w:p>
-    <w:p>
-      <w:pPr>
-        <w:pStyle w:val="ListParagraph"/>
-        <w:numPr>
-          <w:ilvl w:val="0"/>
-          <w:numId w:val="3"/>
-        </w:numPr>
-      </w:pPr>
-      <w:r>
-        <w:rPr>
-          <w:b/>
-          <w:bCs/>
-        </w:rPr>
-        <w:t>Host.AMDFrameGen_allowAsyncWorkloads(value)</w:t>
-      </w:r>
-      <w:r>
-        <w:t xml:space="preserve"> – value is optional. If given, sets the setting to this value. Returns the value of the setting when this function was called.</w:t>
-      </w:r>
-    </w:p>
-    <w:p>
-      <w:pPr>
-        <w:pStyle w:val="ListParagraph"/>
-        <w:numPr>
-          <w:ilvl w:val="0"/>
-          <w:numId w:val="3"/>
-        </w:numPr>
-      </w:pPr>
-      <w:r>
-        <w:rPr>
-          <w:b/>
-          <w:bCs/>
-        </w:rPr>
-        <w:t>Host.AMDFrameGen_onlyPresentGenerated(value)</w:t>
-      </w:r>
-      <w:r>
-        <w:t xml:space="preserve"> – value is optional. If given, sets the setting to this value. Returns the value of the setting when this function was called.</w:t>
-      </w:r>
-    </w:p>
-    <w:p>
-      <w:pPr>
-        <w:pStyle w:val="ListParagraph"/>
-        <w:numPr>
-          <w:ilvl w:val="0"/>
-          <w:numId w:val="3"/>
-        </w:numPr>
-      </w:pPr>
-      <w:r>
-        <w:rPr>
-          <w:b/>
-          <w:bCs/>
-        </w:rPr>
-        <w:t>Host.AMDFrameGen_constrainToRectangle(value)</w:t>
-      </w:r>
-      <w:r>
-        <w:t xml:space="preserve"> – value is optional. If given, sets the setting to this value. Returns the value of the setting when this function was called.</w:t>
-      </w:r>
-    </w:p>
-    <w:p>
-      <w:pPr>
-        <w:pStyle w:val="ListParagraph"/>
-        <w:numPr>
-          <w:ilvl w:val="0"/>
-          <w:numId w:val="3"/>
-        </w:numPr>
-      </w:pPr>
-      <w:r>
-        <w:rPr>
-          <w:b/>
-          <w:bCs/>
-        </w:rPr>
         <w:t>Host.SetWindowSize(width, height)</w:t>
       </w:r>
       <w:r>
@@ -3451,7 +3507,6 @@
           <w:b/>
           <w:bCs/>
         </w:rPr>
-        <w:lastRenderedPageBreak/>
         <w:t>Host.TextureFormat_FIRST</w:t>
       </w:r>
       <w:r>

</xml_diff>